<commit_message>
Service PO template report updated
</commit_message>
<xml_diff>
--- a/APLOS/POPResources/Templates/ServicePurchaseOrder202015.docx
+++ b/APLOS/POPResources/Templates/ServicePurchaseOrder202015.docx
@@ -1,6 +1,6 @@
 
 <file path=word/document.xml><?xml version="1.0" encoding="utf-8"?>
-<w:document xmlns:wpc="http://schemas.microsoft.com/office/word/2010/wordprocessingCanvas" xmlns:mc="http://schemas.openxmlformats.org/markup-compatibility/2006" xmlns:o="urn:schemas-microsoft-com:office:office" xmlns:r="http://schemas.openxmlformats.org/officeDocument/2006/relationships" xmlns:m="http://schemas.openxmlformats.org/officeDocument/2006/math" xmlns:v="urn:schemas-microsoft-com:vml" xmlns:wp14="http://schemas.microsoft.com/office/word/2010/wordprocessingDrawing" xmlns:wp="http://schemas.openxmlformats.org/drawingml/2006/wordprocessingDrawing" xmlns:w10="urn:schemas-microsoft-com:office:word" xmlns:w="http://schemas.openxmlformats.org/wordprocessingml/2006/main" xmlns:w14="http://schemas.microsoft.com/office/word/2010/wordml" xmlns:wpg="http://schemas.microsoft.com/office/word/2010/wordprocessingGroup" xmlns:wpi="http://schemas.microsoft.com/office/word/2010/wordprocessingInk" xmlns:wne="http://schemas.microsoft.com/office/word/2006/wordml" xmlns:wps="http://schemas.microsoft.com/office/word/2010/wordprocessingShape" mc:Ignorable="w14 wp14">
+<w:document xmlns:wpc="http://schemas.microsoft.com/office/word/2010/wordprocessingCanvas" xmlns:cx="http://schemas.microsoft.com/office/drawing/2014/chartex" xmlns:cx1="http://schemas.microsoft.com/office/drawing/2015/9/8/chartex" xmlns:cx2="http://schemas.microsoft.com/office/drawing/2015/10/21/chartex" xmlns:cx3="http://schemas.microsoft.com/office/drawing/2016/5/9/chartex" xmlns:cx4="http://schemas.microsoft.com/office/drawing/2016/5/10/chartex" xmlns:cx5="http://schemas.microsoft.com/office/drawing/2016/5/11/chartex" xmlns:cx6="http://schemas.microsoft.com/office/drawing/2016/5/12/chartex" xmlns:cx7="http://schemas.microsoft.com/office/drawing/2016/5/13/chartex" xmlns:cx8="http://schemas.microsoft.com/office/drawing/2016/5/14/chartex" xmlns:mc="http://schemas.openxmlformats.org/markup-compatibility/2006" xmlns:aink="http://schemas.microsoft.com/office/drawing/2016/ink" xmlns:am3d="http://schemas.microsoft.com/office/drawing/2017/model3d" xmlns:o="urn:schemas-microsoft-com:office:office" xmlns:r="http://schemas.openxmlformats.org/officeDocument/2006/relationships" xmlns:m="http://schemas.openxmlformats.org/officeDocument/2006/math" xmlns:v="urn:schemas-microsoft-com:vml" xmlns:wp14="http://schemas.microsoft.com/office/word/2010/wordprocessingDrawing" xmlns:wp="http://schemas.openxmlformats.org/drawingml/2006/wordprocessingDrawing" xmlns:w10="urn:schemas-microsoft-com:office:word" xmlns:w="http://schemas.openxmlformats.org/wordprocessingml/2006/main" xmlns:w14="http://schemas.microsoft.com/office/word/2010/wordml" xmlns:w15="http://schemas.microsoft.com/office/word/2012/wordml" xmlns:w16cex="http://schemas.microsoft.com/office/word/2018/wordml/cex" xmlns:w16cid="http://schemas.microsoft.com/office/word/2016/wordml/cid" xmlns:w16="http://schemas.microsoft.com/office/word/2018/wordml" xmlns:w16sdtdh="http://schemas.microsoft.com/office/word/2020/wordml/sdtdatahash" xmlns:w16se="http://schemas.microsoft.com/office/word/2015/wordml/symex" xmlns:wpg="http://schemas.microsoft.com/office/word/2010/wordprocessingGroup" xmlns:wpi="http://schemas.microsoft.com/office/word/2010/wordprocessingInk" xmlns:wne="http://schemas.microsoft.com/office/word/2006/wordml" xmlns:wps="http://schemas.microsoft.com/office/word/2010/wordprocessingShape" mc:Ignorable="w14 w15 w16se w16cid w16 w16cex w16sdtdh wp14">
   <w:body>
     <w:p>
       <w:pPr>
@@ -71,7 +71,6 @@
                       <wps:txbx>
                         <w:txbxContent>
                           <w:p>
-                            <w:proofErr w:type="spellStart"/>
                             <w:r>
                               <w:rPr>
                                 <w:rFonts w:ascii="Tahoma" w:hAnsi="Tahoma" w:cs="Tahoma"/>
@@ -81,19 +80,7 @@
                                 <w:szCs w:val="16"/>
                                 <w:shd w:val="clear" w:color="auto" w:fill="FFFFFF"/>
                               </w:rPr>
-                              <w:t>Vasudha</w:t>
-                            </w:r>
-                            <w:proofErr w:type="spellEnd"/>
-                            <w:r>
-                              <w:rPr>
-                                <w:rFonts w:ascii="Tahoma" w:hAnsi="Tahoma" w:cs="Tahoma"/>
-                                <w:b/>
-                                <w:bCs/>
-                                <w:sz w:val="16"/>
-                                <w:szCs w:val="16"/>
-                                <w:shd w:val="clear" w:color="auto" w:fill="FFFFFF"/>
-                              </w:rPr>
-                              <w:t xml:space="preserve"> Swaraj</w:t>
+                              <w:t>Vasudha Swaraj</w:t>
                             </w:r>
                           </w:p>
                         </w:txbxContent>
@@ -118,11 +105,10 @@
           </mc:Choice>
           <mc:Fallback>
             <w:pict>
-              <v:rect id="Rectangle 9" o:spid="_x0000_s1026" style="position:absolute;left:0;text-align:left;margin-left:-22.15pt;margin-top:-21.55pt;width:134.25pt;height:18.75pt;z-index:251694080;visibility:visible;mso-wrap-style:square;mso-width-percent:0;mso-height-percent:0;mso-wrap-distance-left:9pt;mso-wrap-distance-top:0;mso-wrap-distance-right:9pt;mso-wrap-distance-bottom:0;mso-position-horizontal:absolute;mso-position-horizontal-relative:text;mso-position-vertical:absolute;mso-position-vertical-relative:text;mso-width-percent:0;mso-height-percent:0;mso-width-relative:margin;mso-height-relative:margin;v-text-anchor:middle" o:gfxdata="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" fillcolor="white [3201]" strokecolor="white [3212]" strokeweight="1pt">
+              <v:rect w14:anchorId="39922CDA" id="Rectangle 9" o:spid="_x0000_s1026" style="position:absolute;left:0;text-align:left;margin-left:-22.15pt;margin-top:-21.55pt;width:134.25pt;height:18.75pt;z-index:251694080;visibility:visible;mso-wrap-style:square;mso-width-percent:0;mso-height-percent:0;mso-wrap-distance-left:9pt;mso-wrap-distance-top:0;mso-wrap-distance-right:9pt;mso-wrap-distance-bottom:0;mso-position-horizontal:absolute;mso-position-horizontal-relative:text;mso-position-vertical:absolute;mso-position-vertical-relative:text;mso-width-percent:0;mso-height-percent:0;mso-width-relative:margin;mso-height-relative:margin;v-text-anchor:middle" o:gfxdata="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" fillcolor="white [3201]" strokecolor="white [3212]" strokeweight="1pt">
                 <v:textbox>
                   <w:txbxContent>
                     <w:p>
-                      <w:proofErr w:type="spellStart"/>
                       <w:r>
                         <w:rPr>
                           <w:rFonts w:ascii="Tahoma" w:hAnsi="Tahoma" w:cs="Tahoma"/>
@@ -132,19 +118,7 @@
                           <w:szCs w:val="16"/>
                           <w:shd w:val="clear" w:color="auto" w:fill="FFFFFF"/>
                         </w:rPr>
-                        <w:t>Vasudha</w:t>
-                      </w:r>
-                      <w:proofErr w:type="spellEnd"/>
-                      <w:r>
-                        <w:rPr>
-                          <w:rFonts w:ascii="Tahoma" w:hAnsi="Tahoma" w:cs="Tahoma"/>
-                          <w:b/>
-                          <w:bCs/>
-                          <w:sz w:val="16"/>
-                          <w:szCs w:val="16"/>
-                          <w:shd w:val="clear" w:color="auto" w:fill="FFFFFF"/>
-                        </w:rPr>
-                        <w:t xml:space="preserve"> Swaraj</w:t>
+                        <w:t>Vasudha Swaraj</w:t>
                       </w:r>
                     </w:p>
                   </w:txbxContent>
@@ -399,7 +373,7 @@
           </mc:Choice>
           <mc:Fallback>
             <w:pict>
-              <v:rect id="Rectangle 8" o:spid="_x0000_s1027" style="position:absolute;margin-left:-21.95pt;margin-top:9.15pt;width:183.35pt;height:20.05pt;z-index:251687936;visibility:visible;mso-wrap-style:square;mso-height-percent:0;mso-wrap-distance-left:9pt;mso-wrap-distance-top:0;mso-wrap-distance-right:9pt;mso-wrap-distance-bottom:0;mso-position-horizontal:absolute;mso-position-horizontal-relative:text;mso-position-vertical:absolute;mso-position-vertical-relative:text;mso-height-percent:0;mso-height-relative:margin;v-text-anchor:middle" o:gfxdata="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" fillcolor="white [3201]" strokecolor="white [3212]" strokeweight="1pt">
+              <v:rect w14:anchorId="646498CD" id="Rectangle 8" o:spid="_x0000_s1027" style="position:absolute;margin-left:-21.95pt;margin-top:9.15pt;width:183.35pt;height:20.05pt;z-index:251687936;visibility:visible;mso-wrap-style:square;mso-height-percent:0;mso-wrap-distance-left:9pt;mso-wrap-distance-top:0;mso-wrap-distance-right:9pt;mso-wrap-distance-bottom:0;mso-position-horizontal:absolute;mso-position-horizontal-relative:text;mso-position-vertical:absolute;mso-position-vertical-relative:text;mso-height-percent:0;mso-height-relative:margin;v-text-anchor:middle" o:gfxdata="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" fillcolor="white [3201]" strokecolor="white [3212]" strokeweight="1pt">
                 <v:textbox>
                   <w:txbxContent>
                     <w:p>
@@ -490,25 +464,7 @@
                 <w:sz w:val="16"/>
                 <w:szCs w:val="16"/>
               </w:rPr>
-              <w:t>PO No: {</w:t>
-            </w:r>
-            <w:proofErr w:type="spellStart"/>
-            <w:r>
-              <w:rPr>
-                <w:rFonts w:ascii="Tahoma" w:hAnsi="Tahoma" w:cs="Tahoma"/>
-                <w:sz w:val="16"/>
-                <w:szCs w:val="16"/>
-              </w:rPr>
-              <w:t>PONumber</w:t>
-            </w:r>
-            <w:proofErr w:type="spellEnd"/>
-            <w:r>
-              <w:rPr>
-                <w:rFonts w:ascii="Tahoma" w:hAnsi="Tahoma" w:cs="Tahoma"/>
-                <w:sz w:val="16"/>
-                <w:szCs w:val="16"/>
-              </w:rPr>
-              <w:t>}</w:t>
+              <w:t>PO No: {PONumber}</w:t>
             </w:r>
           </w:p>
           <w:p>
@@ -529,25 +485,7 @@
                 <w:sz w:val="16"/>
                 <w:szCs w:val="16"/>
               </w:rPr>
-              <w:t>Vendor Name:{</w:t>
-            </w:r>
-            <w:proofErr w:type="spellStart"/>
-            <w:r>
-              <w:rPr>
-                <w:rFonts w:ascii="Tahoma" w:hAnsi="Tahoma" w:cs="Tahoma"/>
-                <w:sz w:val="16"/>
-                <w:szCs w:val="16"/>
-              </w:rPr>
-              <w:t>VendorName</w:t>
-            </w:r>
-            <w:proofErr w:type="spellEnd"/>
-            <w:r>
-              <w:rPr>
-                <w:rFonts w:ascii="Tahoma" w:hAnsi="Tahoma" w:cs="Tahoma"/>
-                <w:sz w:val="16"/>
-                <w:szCs w:val="16"/>
-              </w:rPr>
-              <w:t>}</w:t>
+              <w:t>Vendor Name:{VendorName}</w:t>
             </w:r>
           </w:p>
           <w:p>
@@ -568,25 +506,7 @@
                 <w:sz w:val="16"/>
                 <w:szCs w:val="16"/>
               </w:rPr>
-              <w:t>Currency Name:{</w:t>
-            </w:r>
-            <w:proofErr w:type="spellStart"/>
-            <w:r>
-              <w:rPr>
-                <w:rFonts w:ascii="Tahoma" w:hAnsi="Tahoma" w:cs="Tahoma"/>
-                <w:sz w:val="16"/>
-                <w:szCs w:val="16"/>
-              </w:rPr>
-              <w:t>CurrencyName</w:t>
-            </w:r>
-            <w:proofErr w:type="spellEnd"/>
-            <w:r>
-              <w:rPr>
-                <w:rFonts w:ascii="Tahoma" w:hAnsi="Tahoma" w:cs="Tahoma"/>
-                <w:sz w:val="16"/>
-                <w:szCs w:val="16"/>
-              </w:rPr>
-              <w:t>}</w:t>
+              <w:t>Currency Name:{CurrencyName}</w:t>
             </w:r>
           </w:p>
         </w:tc>
@@ -606,23 +526,7 @@
                 <w:rFonts w:ascii="Tahoma" w:hAnsi="Tahoma" w:cs="Tahoma"/>
                 <w:sz w:val="16"/>
               </w:rPr>
-              <w:t>Dated: {</w:t>
-            </w:r>
-            <w:proofErr w:type="spellStart"/>
-            <w:r>
-              <w:rPr>
-                <w:rFonts w:ascii="Tahoma" w:hAnsi="Tahoma" w:cs="Tahoma"/>
-                <w:sz w:val="16"/>
-              </w:rPr>
-              <w:t>PODate</w:t>
-            </w:r>
-            <w:proofErr w:type="spellEnd"/>
-            <w:r>
-              <w:rPr>
-                <w:rFonts w:ascii="Tahoma" w:hAnsi="Tahoma" w:cs="Tahoma"/>
-                <w:sz w:val="16"/>
-              </w:rPr>
-              <w:t>}</w:t>
+              <w:t>Dated: {PODate}</w:t>
             </w:r>
           </w:p>
           <w:p>
@@ -632,37 +536,12 @@
                 <w:sz w:val="16"/>
               </w:rPr>
             </w:pPr>
-            <w:proofErr w:type="spellStart"/>
             <w:r>
               <w:rPr>
                 <w:rFonts w:ascii="Tahoma" w:hAnsi="Tahoma" w:cs="Tahoma"/>
                 <w:sz w:val="16"/>
               </w:rPr>
-              <w:t>VendoType</w:t>
-            </w:r>
-            <w:proofErr w:type="spellEnd"/>
-            <w:r>
-              <w:rPr>
-                <w:rFonts w:ascii="Tahoma" w:hAnsi="Tahoma" w:cs="Tahoma"/>
-                <w:sz w:val="16"/>
-              </w:rPr>
-              <w:t>:{</w:t>
-            </w:r>
-            <w:proofErr w:type="spellStart"/>
-            <w:r>
-              <w:rPr>
-                <w:rFonts w:ascii="Tahoma" w:hAnsi="Tahoma" w:cs="Tahoma"/>
-                <w:sz w:val="16"/>
-              </w:rPr>
-              <w:t>PartyType</w:t>
-            </w:r>
-            <w:proofErr w:type="spellEnd"/>
-            <w:r>
-              <w:rPr>
-                <w:rFonts w:ascii="Tahoma" w:hAnsi="Tahoma" w:cs="Tahoma"/>
-                <w:sz w:val="16"/>
-              </w:rPr>
-              <w:t>}</w:t>
+              <w:t>VendoType:{PartyType}</w:t>
             </w:r>
           </w:p>
           <w:p>
@@ -677,23 +556,7 @@
                 <w:rFonts w:ascii="Tahoma" w:hAnsi="Tahoma" w:cs="Tahoma"/>
                 <w:sz w:val="16"/>
               </w:rPr>
-              <w:t>Payment Term:{</w:t>
-            </w:r>
-            <w:proofErr w:type="spellStart"/>
-            <w:r>
-              <w:rPr>
-                <w:rFonts w:ascii="Tahoma" w:hAnsi="Tahoma" w:cs="Tahoma"/>
-                <w:sz w:val="16"/>
-              </w:rPr>
-              <w:t>PaymentTerm</w:t>
-            </w:r>
-            <w:proofErr w:type="spellEnd"/>
-            <w:r>
-              <w:rPr>
-                <w:rFonts w:ascii="Tahoma" w:hAnsi="Tahoma" w:cs="Tahoma"/>
-                <w:sz w:val="16"/>
-              </w:rPr>
-              <w:t>}</w:t>
+              <w:t>Payment Term:{PaymentTerm}</w:t>
             </w:r>
           </w:p>
         </w:tc>
@@ -713,23 +576,7 @@
                 <w:rFonts w:ascii="Tahoma" w:hAnsi="Tahoma" w:cs="Tahoma"/>
                 <w:sz w:val="16"/>
               </w:rPr>
-              <w:t>PO Type: {</w:t>
-            </w:r>
-            <w:proofErr w:type="spellStart"/>
-            <w:r>
-              <w:rPr>
-                <w:rFonts w:ascii="Tahoma" w:hAnsi="Tahoma" w:cs="Tahoma"/>
-                <w:sz w:val="16"/>
-              </w:rPr>
-              <w:t>POType</w:t>
-            </w:r>
-            <w:proofErr w:type="spellEnd"/>
-            <w:r>
-              <w:rPr>
-                <w:rFonts w:ascii="Tahoma" w:hAnsi="Tahoma" w:cs="Tahoma"/>
-                <w:sz w:val="16"/>
-              </w:rPr>
-              <w:t>}</w:t>
+              <w:t>PO Type: {POType}</w:t>
             </w:r>
           </w:p>
           <w:p>
@@ -744,23 +591,7 @@
                 <w:rFonts w:ascii="Tahoma" w:hAnsi="Tahoma" w:cs="Tahoma"/>
                 <w:sz w:val="16"/>
               </w:rPr>
-              <w:t>Invoicing Party Name:{</w:t>
-            </w:r>
-            <w:proofErr w:type="spellStart"/>
-            <w:r>
-              <w:rPr>
-                <w:rFonts w:ascii="Tahoma" w:hAnsi="Tahoma" w:cs="Tahoma"/>
-                <w:sz w:val="16"/>
-              </w:rPr>
-              <w:t>InvoicingPartyName</w:t>
-            </w:r>
-            <w:proofErr w:type="spellEnd"/>
-            <w:r>
-              <w:rPr>
-                <w:rFonts w:ascii="Tahoma" w:hAnsi="Tahoma" w:cs="Tahoma"/>
-                <w:sz w:val="16"/>
-              </w:rPr>
-              <w:t>}</w:t>
+              <w:t>Invoicing Party Name:{InvoicingPartyName}</w:t>
             </w:r>
           </w:p>
         </w:tc>
@@ -776,37 +607,12 @@
                 <w:sz w:val="16"/>
               </w:rPr>
             </w:pPr>
-            <w:proofErr w:type="spellStart"/>
             <w:r>
               <w:rPr>
                 <w:rFonts w:ascii="Tahoma" w:hAnsi="Tahoma" w:cs="Tahoma"/>
                 <w:sz w:val="16"/>
               </w:rPr>
-              <w:t>Credtible</w:t>
-            </w:r>
-            <w:proofErr w:type="spellEnd"/>
-            <w:r>
-              <w:rPr>
-                <w:rFonts w:ascii="Tahoma" w:hAnsi="Tahoma" w:cs="Tahoma"/>
-                <w:sz w:val="16"/>
-              </w:rPr>
-              <w:t xml:space="preserve"> Status:{</w:t>
-            </w:r>
-            <w:proofErr w:type="spellStart"/>
-            <w:r>
-              <w:rPr>
-                <w:rFonts w:ascii="Tahoma" w:hAnsi="Tahoma" w:cs="Tahoma"/>
-                <w:sz w:val="16"/>
-              </w:rPr>
-              <w:t>CredtibleStatus</w:t>
-            </w:r>
-            <w:proofErr w:type="spellEnd"/>
-            <w:r>
-              <w:rPr>
-                <w:rFonts w:ascii="Tahoma" w:hAnsi="Tahoma" w:cs="Tahoma"/>
-                <w:sz w:val="16"/>
-              </w:rPr>
-              <w:t>}</w:t>
+              <w:t>Credtible Status:{CredtibleStatus}</w:t>
             </w:r>
           </w:p>
           <w:p>
@@ -822,23 +628,7 @@
                 <w:rFonts w:ascii="Tahoma" w:hAnsi="Tahoma" w:cs="Tahoma"/>
                 <w:sz w:val="16"/>
               </w:rPr>
-              <w:t>Delivery Party:{</w:t>
-            </w:r>
-            <w:proofErr w:type="spellStart"/>
-            <w:r>
-              <w:rPr>
-                <w:rFonts w:ascii="Tahoma" w:hAnsi="Tahoma" w:cs="Tahoma"/>
-                <w:sz w:val="16"/>
-              </w:rPr>
-              <w:t>DeliveryParty</w:t>
-            </w:r>
-            <w:proofErr w:type="spellEnd"/>
-            <w:r>
-              <w:rPr>
-                <w:rFonts w:ascii="Tahoma" w:hAnsi="Tahoma" w:cs="Tahoma"/>
-                <w:sz w:val="16"/>
-              </w:rPr>
-              <w:t>}</w:t>
+              <w:t>Delivery Party:{DeliveryParty}</w:t>
             </w:r>
           </w:p>
         </w:tc>
@@ -895,25 +685,7 @@
                 <w:sz w:val="16"/>
                 <w:szCs w:val="16"/>
               </w:rPr>
-              <w:t xml:space="preserve">With Reference to your above quotation, we agree to purchase the following </w:t>
-            </w:r>
-            <w:proofErr w:type="spellStart"/>
-            <w:r>
-              <w:rPr>
-                <w:rFonts w:ascii="Tahoma" w:eastAsia="Arial" w:hAnsi="Tahoma" w:cs="Tahoma"/>
-                <w:sz w:val="16"/>
-                <w:szCs w:val="16"/>
-              </w:rPr>
-              <w:t>servises</w:t>
-            </w:r>
-            <w:proofErr w:type="spellEnd"/>
-            <w:r>
-              <w:rPr>
-                <w:rFonts w:ascii="Tahoma" w:eastAsia="Arial" w:hAnsi="Tahoma" w:cs="Tahoma"/>
-                <w:sz w:val="16"/>
-                <w:szCs w:val="16"/>
-              </w:rPr>
-              <w:t xml:space="preserve"> -</w:t>
+              <w:t>With Reference to your above quotation, we agree to purchase the following servises -</w:t>
             </w:r>
           </w:p>
         </w:tc>
@@ -953,7 +725,6 @@
               </w:rPr>
               <w:t>{</w:t>
             </w:r>
-            <w:proofErr w:type="spellStart"/>
             <w:r>
               <w:rPr>
                 <w:rFonts w:ascii="Tahoma" w:hAnsi="Tahoma" w:cs="Tahoma"/>
@@ -963,7 +734,6 @@
               </w:rPr>
               <w:t>ServicePODetail</w:t>
             </w:r>
-            <w:proofErr w:type="spellEnd"/>
             <w:r>
               <w:rPr>
                 <w:rFonts w:ascii="Tahoma" w:eastAsia="Arial" w:hAnsi="Tahoma" w:cs="Tahoma"/>
@@ -1004,29 +774,7 @@
                 <w:sz w:val="16"/>
                 <w:szCs w:val="16"/>
               </w:rPr>
-              <w:t>Total : {</w:t>
-            </w:r>
-            <w:proofErr w:type="spellStart"/>
-            <w:r>
-              <w:rPr>
-                <w:rFonts w:ascii="Tahoma" w:eastAsia="Arial" w:hAnsi="Tahoma" w:cs="Tahoma"/>
-                <w:b/>
-                <w:bCs/>
-                <w:sz w:val="16"/>
-                <w:szCs w:val="16"/>
-              </w:rPr>
-              <w:t>GrandTotal</w:t>
-            </w:r>
-            <w:proofErr w:type="spellEnd"/>
-            <w:r>
-              <w:rPr>
-                <w:rFonts w:ascii="Tahoma" w:eastAsia="Arial" w:hAnsi="Tahoma" w:cs="Tahoma"/>
-                <w:b/>
-                <w:bCs/>
-                <w:sz w:val="16"/>
-                <w:szCs w:val="16"/>
-              </w:rPr>
-              <w:t>}</w:t>
+              <w:t>Total : {GrandTotal}</w:t>
             </w:r>
           </w:p>
           <w:p>
@@ -1047,29 +795,7 @@
                 <w:sz w:val="16"/>
                 <w:szCs w:val="16"/>
               </w:rPr>
-              <w:t>In Words: {</w:t>
-            </w:r>
-            <w:proofErr w:type="spellStart"/>
-            <w:r>
-              <w:rPr>
-                <w:rFonts w:ascii="Tahoma" w:eastAsia="Arial" w:hAnsi="Tahoma" w:cs="Tahoma"/>
-                <w:b/>
-                <w:bCs/>
-                <w:sz w:val="16"/>
-                <w:szCs w:val="16"/>
-              </w:rPr>
-              <w:t>TotalInWords</w:t>
-            </w:r>
-            <w:proofErr w:type="spellEnd"/>
-            <w:r>
-              <w:rPr>
-                <w:rFonts w:ascii="Tahoma" w:eastAsia="Arial" w:hAnsi="Tahoma" w:cs="Tahoma"/>
-                <w:b/>
-                <w:bCs/>
-                <w:sz w:val="16"/>
-                <w:szCs w:val="16"/>
-              </w:rPr>
-              <w:t>}</w:t>
+              <w:t>In Words: {TotalInWords}</w:t>
             </w:r>
           </w:p>
         </w:tc>
@@ -1110,9 +836,18 @@
                 <w:szCs w:val="16"/>
                 <w:u w:val="single"/>
               </w:rPr>
-              <w:t xml:space="preserve">KINDLY SIGN </w:t>
+              <w:t xml:space="preserve">KINDLY SIGN THIS </w:t>
             </w:r>
-            <w:proofErr w:type="gramStart"/>
+            <w:r>
+              <w:rPr>
+                <w:rFonts w:ascii="Tahoma" w:hAnsi="Tahoma" w:cs="Tahoma"/>
+                <w:b/>
+                <w:sz w:val="16"/>
+                <w:szCs w:val="16"/>
+                <w:u w:val="single"/>
+              </w:rPr>
+              <w:t xml:space="preserve"> </w:t>
+            </w:r>
             <w:r>
               <w:rPr>
                 <w:rFonts w:ascii="Tahoma" w:eastAsia="Arial" w:hAnsi="Tahoma" w:cs="Tahoma"/>
@@ -1122,40 +857,7 @@
                 <w:szCs w:val="16"/>
                 <w:u w:val="single"/>
               </w:rPr>
-              <w:t xml:space="preserve">THIS </w:t>
-            </w:r>
-            <w:r>
-              <w:rPr>
-                <w:rFonts w:ascii="Tahoma" w:hAnsi="Tahoma" w:cs="Tahoma"/>
-                <w:b/>
-                <w:sz w:val="16"/>
-                <w:szCs w:val="16"/>
-                <w:u w:val="single"/>
-              </w:rPr>
-              <w:t xml:space="preserve"> </w:t>
-            </w:r>
-            <w:r>
-              <w:rPr>
-                <w:rFonts w:ascii="Tahoma" w:eastAsia="Arial" w:hAnsi="Tahoma" w:cs="Tahoma"/>
-                <w:b/>
-                <w:bCs/>
-                <w:sz w:val="16"/>
-                <w:szCs w:val="16"/>
-                <w:u w:val="single"/>
-              </w:rPr>
-              <w:t>SERVICE</w:t>
-            </w:r>
-            <w:proofErr w:type="gramEnd"/>
-            <w:r>
-              <w:rPr>
-                <w:rFonts w:ascii="Tahoma" w:eastAsia="Arial" w:hAnsi="Tahoma" w:cs="Tahoma"/>
-                <w:b/>
-                <w:bCs/>
-                <w:sz w:val="16"/>
-                <w:szCs w:val="16"/>
-                <w:u w:val="single"/>
-              </w:rPr>
-              <w:t xml:space="preserve"> PURCHASE ORDER AND SEND US BACK BY EMAI</w:t>
+              <w:t>SERVICE PURCHASE ORDER AND SEND US BACK BY EMAI</w:t>
             </w:r>
             <w:r>
               <w:rPr>
@@ -1263,6 +965,7 @@
                 </w:p>
                 <w:p>
                   <w:pPr>
+                    <w:framePr w:hSpace="180" w:wrap="around" w:vAnchor="page" w:hAnchor="margin" w:xAlign="center" w:y="2366"/>
                     <w:jc w:val="center"/>
                   </w:pPr>
                   <w:r>
@@ -1284,31 +987,7 @@
                       <w:szCs w:val="16"/>
                       <w:shd w:val="clear" w:color="auto" w:fill="FFFFFF"/>
                     </w:rPr>
-                    <w:t xml:space="preserve"> </w:t>
-                  </w:r>
-                  <w:proofErr w:type="spellStart"/>
-                  <w:r>
-                    <w:rPr>
-                      <w:rFonts w:ascii="Tahoma" w:hAnsi="Tahoma" w:cs="Tahoma"/>
-                      <w:b/>
-                      <w:bCs/>
-                      <w:sz w:val="16"/>
-                      <w:szCs w:val="16"/>
-                      <w:shd w:val="clear" w:color="auto" w:fill="FFFFFF"/>
-                    </w:rPr>
-                    <w:t>Vasudha</w:t>
-                  </w:r>
-                  <w:proofErr w:type="spellEnd"/>
-                  <w:r>
-                    <w:rPr>
-                      <w:rFonts w:ascii="Tahoma" w:hAnsi="Tahoma" w:cs="Tahoma"/>
-                      <w:b/>
-                      <w:bCs/>
-                      <w:sz w:val="16"/>
-                      <w:szCs w:val="16"/>
-                      <w:shd w:val="clear" w:color="auto" w:fill="FFFFFF"/>
-                    </w:rPr>
-                    <w:t xml:space="preserve"> Swaraj</w:t>
+                    <w:t xml:space="preserve"> Vasudha Swaraj</w:t>
                   </w:r>
                 </w:p>
                 <w:p>
@@ -1423,29 +1102,7 @@
                       <w:sz w:val="16"/>
                       <w:szCs w:val="16"/>
                     </w:rPr>
-                    <w:t>For {</w:t>
-                  </w:r>
-                  <w:proofErr w:type="spellStart"/>
-                  <w:r>
-                    <w:rPr>
-                      <w:rFonts w:ascii="Tahoma" w:eastAsia="Arial" w:hAnsi="Tahoma" w:cs="Tahoma"/>
-                      <w:b/>
-                      <w:bCs/>
-                      <w:sz w:val="16"/>
-                      <w:szCs w:val="16"/>
-                    </w:rPr>
-                    <w:t>VendorName</w:t>
-                  </w:r>
-                  <w:proofErr w:type="spellEnd"/>
-                  <w:r>
-                    <w:rPr>
-                      <w:rFonts w:ascii="Tahoma" w:eastAsia="Arial" w:hAnsi="Tahoma" w:cs="Tahoma"/>
-                      <w:b/>
-                      <w:bCs/>
-                      <w:sz w:val="16"/>
-                      <w:szCs w:val="16"/>
-                    </w:rPr>
-                    <w:t>}</w:t>
+                    <w:t>For {VendorName}</w:t>
                   </w:r>
                 </w:p>
                 <w:p>
@@ -1649,7 +1306,7 @@
                       </mc:Choice>
                       <mc:Fallback>
                         <w:pict>
-                          <v:line id="Straight Connector 3" o:spid="_x0000_s1026" style="position:absolute;flip:x;z-index:251689984;visibility:visible;mso-wrap-style:square;mso-width-percent:0;mso-height-percent:0;mso-wrap-distance-left:9pt;mso-wrap-distance-top:0;mso-wrap-distance-right:9pt;mso-wrap-distance-bottom:0;mso-position-horizontal:absolute;mso-position-horizontal-relative:text;mso-position-vertical:absolute;mso-position-vertical-relative:text;mso-width-percent:0;mso-height-percent:0;mso-width-relative:margin;mso-height-relative:margin" from="30.2pt,8.35pt" to="139.75pt,8.35pt" o:gfxdata="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" strokecolor="black [3213]" strokeweight=".5pt">
+                          <v:line w14:anchorId="0BC84E14" id="Straight Connector 3" o:spid="_x0000_s1026" style="position:absolute;flip:x;z-index:251689984;visibility:visible;mso-wrap-style:square;mso-width-percent:0;mso-height-percent:0;mso-wrap-distance-left:9pt;mso-wrap-distance-top:0;mso-wrap-distance-right:9pt;mso-wrap-distance-bottom:0;mso-position-horizontal:absolute;mso-position-horizontal-relative:text;mso-position-vertical:absolute;mso-position-vertical-relative:text;mso-width-percent:0;mso-height-percent:0;mso-width-relative:margin;mso-height-relative:margin" from="30.2pt,8.35pt" to="139.75pt,8.35pt" o:gfxdata="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" strokecolor="black [3213]" strokeweight=".5pt">
                             <v:stroke joinstyle="miter"/>
                           </v:line>
                         </w:pict>
@@ -1665,7 +1322,6 @@
                     </w:rPr>
                     <w:t>{</w:t>
                   </w:r>
-                  <w:proofErr w:type="spellStart"/>
                   <w:r>
                     <w:rPr>
                       <w:rFonts w:ascii="Tahoma" w:hAnsi="Tahoma" w:cs="Tahoma"/>
@@ -1676,7 +1332,6 @@
                     </w:rPr>
                     <w:t>AddedBy</w:t>
                   </w:r>
-                  <w:proofErr w:type="spellEnd"/>
                   <w:r>
                     <w:rPr>
                       <w:rFonts w:ascii="Tahoma" w:eastAsia="Arial" w:hAnsi="Tahoma" w:cs="Tahoma"/>
@@ -1772,7 +1427,7 @@
                       </mc:Choice>
                       <mc:Fallback>
                         <w:pict>
-                          <v:line id="Straight Connector 4" o:spid="_x0000_s1026" style="position:absolute;z-index:251691008;visibility:visible;mso-wrap-style:square;mso-width-percent:0;mso-wrap-distance-left:9pt;mso-wrap-distance-top:0;mso-wrap-distance-right:9pt;mso-wrap-distance-bottom:0;mso-position-horizontal:absolute;mso-position-horizontal-relative:text;mso-position-vertical:absolute;mso-position-vertical-relative:text;mso-width-percent:0;mso-width-relative:margin" from="23.5pt,8.35pt" to="143.7pt,8.35pt" o:gfxdata="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" strokecolor="black [3213]" strokeweight=".5pt">
+                          <v:line w14:anchorId="19CA7832" id="Straight Connector 4" o:spid="_x0000_s1026" style="position:absolute;z-index:251691008;visibility:visible;mso-wrap-style:square;mso-width-percent:0;mso-wrap-distance-left:9pt;mso-wrap-distance-top:0;mso-wrap-distance-right:9pt;mso-wrap-distance-bottom:0;mso-position-horizontal:absolute;mso-position-horizontal-relative:text;mso-position-vertical:absolute;mso-position-vertical-relative:text;mso-width-percent:0;mso-width-relative:margin" from="23.5pt,8.35pt" to="143.7pt,8.35pt" o:gfxdata="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" strokecolor="black [3213]" strokeweight=".5pt">
                             <v:stroke joinstyle="miter"/>
                           </v:line>
                         </w:pict>
@@ -1788,7 +1443,6 @@
                     </w:rPr>
                     <w:t xml:space="preserve">          {</w:t>
                   </w:r>
-                  <w:proofErr w:type="spellStart"/>
                   <w:r>
                     <w:rPr>
                       <w:rFonts w:ascii="Tahoma" w:hAnsi="Tahoma" w:cs="Tahoma"/>
@@ -1799,7 +1453,6 @@
                     </w:rPr>
                     <w:t>CheckedBy</w:t>
                   </w:r>
-                  <w:proofErr w:type="spellEnd"/>
                   <w:r>
                     <w:rPr>
                       <w:rFonts w:ascii="Tahoma" w:eastAsia="Arial" w:hAnsi="Tahoma" w:cs="Tahoma"/>
@@ -1892,7 +1545,7 @@
                       </mc:Choice>
                       <mc:Fallback>
                         <w:pict>
-                          <v:line id="Straight Connector 5" o:spid="_x0000_s1026" style="position:absolute;z-index:251692032;visibility:visible;mso-wrap-style:square;mso-wrap-distance-left:9pt;mso-wrap-distance-top:0;mso-wrap-distance-right:9pt;mso-wrap-distance-bottom:0;mso-position-horizontal:absolute;mso-position-horizontal-relative:text;mso-position-vertical:absolute;mso-position-vertical-relative:text" from="31.2pt,8.35pt" to="143.25pt,8.35pt" o:gfxdata="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" strokecolor="black [3213]" strokeweight=".5pt">
+                          <v:line w14:anchorId="2AC70728" id="Straight Connector 5" o:spid="_x0000_s1026" style="position:absolute;z-index:251692032;visibility:visible;mso-wrap-style:square;mso-wrap-distance-left:9pt;mso-wrap-distance-top:0;mso-wrap-distance-right:9pt;mso-wrap-distance-bottom:0;mso-position-horizontal:absolute;mso-position-horizontal-relative:text;mso-position-vertical:absolute;mso-position-vertical-relative:text" from="31.2pt,8.35pt" to="143.25pt,8.35pt" o:gfxdata="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" strokecolor="black [3213]" strokeweight=".5pt">
                             <v:stroke joinstyle="miter"/>
                           </v:line>
                         </w:pict>
@@ -1908,7 +1561,6 @@
                     </w:rPr>
                     <w:t xml:space="preserve">             {</w:t>
                   </w:r>
-                  <w:proofErr w:type="spellStart"/>
                   <w:r>
                     <w:rPr>
                       <w:rFonts w:ascii="Tahoma" w:hAnsi="Tahoma" w:cs="Tahoma"/>
@@ -1918,7 +1570,6 @@
                     </w:rPr>
                     <w:t>ApprovedBy</w:t>
                   </w:r>
-                  <w:proofErr w:type="spellEnd"/>
                   <w:r>
                     <w:rPr>
                       <w:rFonts w:ascii="Tahoma" w:eastAsia="Arial" w:hAnsi="Tahoma" w:cs="Tahoma"/>
@@ -1987,7 +1638,17 @@
                       <w:sz w:val="16"/>
                       <w:szCs w:val="16"/>
                     </w:rPr>
-                    <w:t xml:space="preserve">      Checked By</w:t>
+                    <w:t xml:space="preserve">      </w:t>
+                  </w:r>
+                  <w:r>
+                    <w:rPr>
+                      <w:rFonts w:ascii="Tahoma" w:eastAsia="Arial" w:hAnsi="Tahoma" w:cs="Tahoma"/>
+                      <w:b/>
+                      <w:bCs/>
+                      <w:sz w:val="16"/>
+                      <w:szCs w:val="16"/>
+                    </w:rPr>
+                    <w:t>{PurOrCheckedStatus} By</w:t>
                   </w:r>
                 </w:p>
               </w:tc>
@@ -2046,12 +1707,12 @@
       </w:pPr>
     </w:p>
     <w:sectPr>
-      <w:headerReference w:type="even" r:id="rId9"/>
-      <w:headerReference w:type="default" r:id="rId10"/>
-      <w:footerReference w:type="even" r:id="rId11"/>
-      <w:footerReference w:type="default" r:id="rId12"/>
-      <w:headerReference w:type="first" r:id="rId13"/>
-      <w:footerReference w:type="first" r:id="rId14"/>
+      <w:headerReference w:type="even" r:id="rId8"/>
+      <w:headerReference w:type="default" r:id="rId9"/>
+      <w:footerReference w:type="even" r:id="rId10"/>
+      <w:footerReference w:type="default" r:id="rId11"/>
+      <w:headerReference w:type="first" r:id="rId12"/>
+      <w:footerReference w:type="first" r:id="rId13"/>
       <w:pgSz w:w="20160" w:h="12240" w:orient="landscape" w:code="5"/>
       <w:pgMar w:top="1440" w:right="1800" w:bottom="1440" w:left="1800" w:header="0" w:footer="0" w:gutter="0"/>
       <w:cols w:space="720"/>
@@ -2062,7 +1723,7 @@
 </file>
 
 <file path=word/endnotes.xml><?xml version="1.0" encoding="utf-8"?>
-<w:endnotes xmlns:wpc="http://schemas.microsoft.com/office/word/2010/wordprocessingCanvas" xmlns:mc="http://schemas.openxmlformats.org/markup-compatibility/2006" xmlns:o="urn:schemas-microsoft-com:office:office" xmlns:r="http://schemas.openxmlformats.org/officeDocument/2006/relationships" xmlns:m="http://schemas.openxmlformats.org/officeDocument/2006/math" xmlns:v="urn:schemas-microsoft-com:vml" xmlns:wp14="http://schemas.microsoft.com/office/word/2010/wordprocessingDrawing" xmlns:wp="http://schemas.openxmlformats.org/drawingml/2006/wordprocessingDrawing" xmlns:w10="urn:schemas-microsoft-com:office:word" xmlns:w="http://schemas.openxmlformats.org/wordprocessingml/2006/main" xmlns:w14="http://schemas.microsoft.com/office/word/2010/wordml" xmlns:wpg="http://schemas.microsoft.com/office/word/2010/wordprocessingGroup" xmlns:wpi="http://schemas.microsoft.com/office/word/2010/wordprocessingInk" xmlns:wne="http://schemas.microsoft.com/office/word/2006/wordml" xmlns:wps="http://schemas.microsoft.com/office/word/2010/wordprocessingShape" mc:Ignorable="w14 wp14">
+<w:endnotes xmlns:wpc="http://schemas.microsoft.com/office/word/2010/wordprocessingCanvas" xmlns:cx="http://schemas.microsoft.com/office/drawing/2014/chartex" xmlns:cx1="http://schemas.microsoft.com/office/drawing/2015/9/8/chartex" xmlns:cx2="http://schemas.microsoft.com/office/drawing/2015/10/21/chartex" xmlns:cx3="http://schemas.microsoft.com/office/drawing/2016/5/9/chartex" xmlns:cx4="http://schemas.microsoft.com/office/drawing/2016/5/10/chartex" xmlns:cx5="http://schemas.microsoft.com/office/drawing/2016/5/11/chartex" xmlns:cx6="http://schemas.microsoft.com/office/drawing/2016/5/12/chartex" xmlns:cx7="http://schemas.microsoft.com/office/drawing/2016/5/13/chartex" xmlns:cx8="http://schemas.microsoft.com/office/drawing/2016/5/14/chartex" xmlns:mc="http://schemas.openxmlformats.org/markup-compatibility/2006" xmlns:aink="http://schemas.microsoft.com/office/drawing/2016/ink" xmlns:am3d="http://schemas.microsoft.com/office/drawing/2017/model3d" xmlns:o="urn:schemas-microsoft-com:office:office" xmlns:r="http://schemas.openxmlformats.org/officeDocument/2006/relationships" xmlns:m="http://schemas.openxmlformats.org/officeDocument/2006/math" xmlns:v="urn:schemas-microsoft-com:vml" xmlns:wp14="http://schemas.microsoft.com/office/word/2010/wordprocessingDrawing" xmlns:wp="http://schemas.openxmlformats.org/drawingml/2006/wordprocessingDrawing" xmlns:w10="urn:schemas-microsoft-com:office:word" xmlns:w="http://schemas.openxmlformats.org/wordprocessingml/2006/main" xmlns:w14="http://schemas.microsoft.com/office/word/2010/wordml" xmlns:w15="http://schemas.microsoft.com/office/word/2012/wordml" xmlns:w16cex="http://schemas.microsoft.com/office/word/2018/wordml/cex" xmlns:w16cid="http://schemas.microsoft.com/office/word/2016/wordml/cid" xmlns:w16="http://schemas.microsoft.com/office/word/2018/wordml" xmlns:w16sdtdh="http://schemas.microsoft.com/office/word/2020/wordml/sdtdatahash" xmlns:w16se="http://schemas.microsoft.com/office/word/2015/wordml/symex" xmlns:wpg="http://schemas.microsoft.com/office/word/2010/wordprocessingGroup" xmlns:wpi="http://schemas.microsoft.com/office/word/2010/wordprocessingInk" xmlns:wne="http://schemas.microsoft.com/office/word/2006/wordml" xmlns:wps="http://schemas.microsoft.com/office/word/2010/wordprocessingShape" mc:Ignorable="w14 w15 w16se w16cid w16 w16cex w16sdtdh wp14">
   <w:endnote w:type="separator" w:id="-1">
     <w:p>
       <w:r>
@@ -2081,7 +1742,7 @@
 </file>
 
 <file path=word/footer1.xml><?xml version="1.0" encoding="utf-8"?>
-<w:ftr xmlns:wpc="http://schemas.microsoft.com/office/word/2010/wordprocessingCanvas" xmlns:mc="http://schemas.openxmlformats.org/markup-compatibility/2006" xmlns:o="urn:schemas-microsoft-com:office:office" xmlns:r="http://schemas.openxmlformats.org/officeDocument/2006/relationships" xmlns:m="http://schemas.openxmlformats.org/officeDocument/2006/math" xmlns:v="urn:schemas-microsoft-com:vml" xmlns:wp14="http://schemas.microsoft.com/office/word/2010/wordprocessingDrawing" xmlns:wp="http://schemas.openxmlformats.org/drawingml/2006/wordprocessingDrawing" xmlns:w10="urn:schemas-microsoft-com:office:word" xmlns:w="http://schemas.openxmlformats.org/wordprocessingml/2006/main" xmlns:w14="http://schemas.microsoft.com/office/word/2010/wordml" xmlns:wpg="http://schemas.microsoft.com/office/word/2010/wordprocessingGroup" xmlns:wpi="http://schemas.microsoft.com/office/word/2010/wordprocessingInk" xmlns:wne="http://schemas.microsoft.com/office/word/2006/wordml" xmlns:wps="http://schemas.microsoft.com/office/word/2010/wordprocessingShape" mc:Ignorable="w14 wp14">
+<w:ftr xmlns:wpc="http://schemas.microsoft.com/office/word/2010/wordprocessingCanvas" xmlns:cx="http://schemas.microsoft.com/office/drawing/2014/chartex" xmlns:cx1="http://schemas.microsoft.com/office/drawing/2015/9/8/chartex" xmlns:cx2="http://schemas.microsoft.com/office/drawing/2015/10/21/chartex" xmlns:cx3="http://schemas.microsoft.com/office/drawing/2016/5/9/chartex" xmlns:cx4="http://schemas.microsoft.com/office/drawing/2016/5/10/chartex" xmlns:cx5="http://schemas.microsoft.com/office/drawing/2016/5/11/chartex" xmlns:cx6="http://schemas.microsoft.com/office/drawing/2016/5/12/chartex" xmlns:cx7="http://schemas.microsoft.com/office/drawing/2016/5/13/chartex" xmlns:cx8="http://schemas.microsoft.com/office/drawing/2016/5/14/chartex" xmlns:mc="http://schemas.openxmlformats.org/markup-compatibility/2006" xmlns:aink="http://schemas.microsoft.com/office/drawing/2016/ink" xmlns:am3d="http://schemas.microsoft.com/office/drawing/2017/model3d" xmlns:o="urn:schemas-microsoft-com:office:office" xmlns:r="http://schemas.openxmlformats.org/officeDocument/2006/relationships" xmlns:m="http://schemas.openxmlformats.org/officeDocument/2006/math" xmlns:v="urn:schemas-microsoft-com:vml" xmlns:wp14="http://schemas.microsoft.com/office/word/2010/wordprocessingDrawing" xmlns:wp="http://schemas.openxmlformats.org/drawingml/2006/wordprocessingDrawing" xmlns:w10="urn:schemas-microsoft-com:office:word" xmlns:w="http://schemas.openxmlformats.org/wordprocessingml/2006/main" xmlns:w14="http://schemas.microsoft.com/office/word/2010/wordml" xmlns:w15="http://schemas.microsoft.com/office/word/2012/wordml" xmlns:w16cex="http://schemas.microsoft.com/office/word/2018/wordml/cex" xmlns:w16cid="http://schemas.microsoft.com/office/word/2016/wordml/cid" xmlns:w16="http://schemas.microsoft.com/office/word/2018/wordml" xmlns:w16sdtdh="http://schemas.microsoft.com/office/word/2020/wordml/sdtdatahash" xmlns:w16se="http://schemas.microsoft.com/office/word/2015/wordml/symex" xmlns:wpg="http://schemas.microsoft.com/office/word/2010/wordprocessingGroup" xmlns:wpi="http://schemas.microsoft.com/office/word/2010/wordprocessingInk" xmlns:wne="http://schemas.microsoft.com/office/word/2006/wordml" xmlns:wps="http://schemas.microsoft.com/office/word/2010/wordprocessingShape" mc:Ignorable="w14 w15 w16se w16cid w16 w16cex w16sdtdh wp14">
   <w:p>
     <w:pPr>
       <w:pStyle w:val="Footer"/>
@@ -2091,7 +1752,7 @@
 </file>
 
 <file path=word/footer2.xml><?xml version="1.0" encoding="utf-8"?>
-<w:ftr xmlns:wpc="http://schemas.microsoft.com/office/word/2010/wordprocessingCanvas" xmlns:mc="http://schemas.openxmlformats.org/markup-compatibility/2006" xmlns:o="urn:schemas-microsoft-com:office:office" xmlns:r="http://schemas.openxmlformats.org/officeDocument/2006/relationships" xmlns:m="http://schemas.openxmlformats.org/officeDocument/2006/math" xmlns:v="urn:schemas-microsoft-com:vml" xmlns:wp14="http://schemas.microsoft.com/office/word/2010/wordprocessingDrawing" xmlns:wp="http://schemas.openxmlformats.org/drawingml/2006/wordprocessingDrawing" xmlns:w10="urn:schemas-microsoft-com:office:word" xmlns:w="http://schemas.openxmlformats.org/wordprocessingml/2006/main" xmlns:w14="http://schemas.microsoft.com/office/word/2010/wordml" xmlns:wpg="http://schemas.microsoft.com/office/word/2010/wordprocessingGroup" xmlns:wpi="http://schemas.microsoft.com/office/word/2010/wordprocessingInk" xmlns:wne="http://schemas.microsoft.com/office/word/2006/wordml" xmlns:wps="http://schemas.microsoft.com/office/word/2010/wordprocessingShape" mc:Ignorable="w14 wp14">
+<w:ftr xmlns:wpc="http://schemas.microsoft.com/office/word/2010/wordprocessingCanvas" xmlns:cx="http://schemas.microsoft.com/office/drawing/2014/chartex" xmlns:cx1="http://schemas.microsoft.com/office/drawing/2015/9/8/chartex" xmlns:cx2="http://schemas.microsoft.com/office/drawing/2015/10/21/chartex" xmlns:cx3="http://schemas.microsoft.com/office/drawing/2016/5/9/chartex" xmlns:cx4="http://schemas.microsoft.com/office/drawing/2016/5/10/chartex" xmlns:cx5="http://schemas.microsoft.com/office/drawing/2016/5/11/chartex" xmlns:cx6="http://schemas.microsoft.com/office/drawing/2016/5/12/chartex" xmlns:cx7="http://schemas.microsoft.com/office/drawing/2016/5/13/chartex" xmlns:cx8="http://schemas.microsoft.com/office/drawing/2016/5/14/chartex" xmlns:mc="http://schemas.openxmlformats.org/markup-compatibility/2006" xmlns:aink="http://schemas.microsoft.com/office/drawing/2016/ink" xmlns:am3d="http://schemas.microsoft.com/office/drawing/2017/model3d" xmlns:o="urn:schemas-microsoft-com:office:office" xmlns:r="http://schemas.openxmlformats.org/officeDocument/2006/relationships" xmlns:m="http://schemas.openxmlformats.org/officeDocument/2006/math" xmlns:v="urn:schemas-microsoft-com:vml" xmlns:wp14="http://schemas.microsoft.com/office/word/2010/wordprocessingDrawing" xmlns:wp="http://schemas.openxmlformats.org/drawingml/2006/wordprocessingDrawing" xmlns:w10="urn:schemas-microsoft-com:office:word" xmlns:w="http://schemas.openxmlformats.org/wordprocessingml/2006/main" xmlns:w14="http://schemas.microsoft.com/office/word/2010/wordml" xmlns:w15="http://schemas.microsoft.com/office/word/2012/wordml" xmlns:w16cex="http://schemas.microsoft.com/office/word/2018/wordml/cex" xmlns:w16cid="http://schemas.microsoft.com/office/word/2016/wordml/cid" xmlns:w16="http://schemas.microsoft.com/office/word/2018/wordml" xmlns:w16sdtdh="http://schemas.microsoft.com/office/word/2020/wordml/sdtdatahash" xmlns:w16se="http://schemas.microsoft.com/office/word/2015/wordml/symex" xmlns:wpg="http://schemas.microsoft.com/office/word/2010/wordprocessingGroup" xmlns:wpi="http://schemas.microsoft.com/office/word/2010/wordprocessingInk" xmlns:wne="http://schemas.microsoft.com/office/word/2006/wordml" xmlns:wps="http://schemas.microsoft.com/office/word/2010/wordprocessingShape" mc:Ignorable="w14 w15 w16se w16cid w16 w16cex w16sdtdh wp14">
   <w:sdt>
     <w:sdtPr>
       <w:id w:val="1647311531"/>
@@ -2139,14 +1800,12 @@
     <w:pPr>
       <w:jc w:val="center"/>
     </w:pPr>
-    <w:bookmarkStart w:id="0" w:name="_GoBack"/>
-    <w:bookmarkEnd w:id="0"/>
   </w:p>
 </w:ftr>
 </file>
 
 <file path=word/footer3.xml><?xml version="1.0" encoding="utf-8"?>
-<w:ftr xmlns:wpc="http://schemas.microsoft.com/office/word/2010/wordprocessingCanvas" xmlns:mc="http://schemas.openxmlformats.org/markup-compatibility/2006" xmlns:o="urn:schemas-microsoft-com:office:office" xmlns:r="http://schemas.openxmlformats.org/officeDocument/2006/relationships" xmlns:m="http://schemas.openxmlformats.org/officeDocument/2006/math" xmlns:v="urn:schemas-microsoft-com:vml" xmlns:wp14="http://schemas.microsoft.com/office/word/2010/wordprocessingDrawing" xmlns:wp="http://schemas.openxmlformats.org/drawingml/2006/wordprocessingDrawing" xmlns:w10="urn:schemas-microsoft-com:office:word" xmlns:w="http://schemas.openxmlformats.org/wordprocessingml/2006/main" xmlns:w14="http://schemas.microsoft.com/office/word/2010/wordml" xmlns:wpg="http://schemas.microsoft.com/office/word/2010/wordprocessingGroup" xmlns:wpi="http://schemas.microsoft.com/office/word/2010/wordprocessingInk" xmlns:wne="http://schemas.microsoft.com/office/word/2006/wordml" xmlns:wps="http://schemas.microsoft.com/office/word/2010/wordprocessingShape" mc:Ignorable="w14 wp14">
+<w:ftr xmlns:wpc="http://schemas.microsoft.com/office/word/2010/wordprocessingCanvas" xmlns:cx="http://schemas.microsoft.com/office/drawing/2014/chartex" xmlns:cx1="http://schemas.microsoft.com/office/drawing/2015/9/8/chartex" xmlns:cx2="http://schemas.microsoft.com/office/drawing/2015/10/21/chartex" xmlns:cx3="http://schemas.microsoft.com/office/drawing/2016/5/9/chartex" xmlns:cx4="http://schemas.microsoft.com/office/drawing/2016/5/10/chartex" xmlns:cx5="http://schemas.microsoft.com/office/drawing/2016/5/11/chartex" xmlns:cx6="http://schemas.microsoft.com/office/drawing/2016/5/12/chartex" xmlns:cx7="http://schemas.microsoft.com/office/drawing/2016/5/13/chartex" xmlns:cx8="http://schemas.microsoft.com/office/drawing/2016/5/14/chartex" xmlns:mc="http://schemas.openxmlformats.org/markup-compatibility/2006" xmlns:aink="http://schemas.microsoft.com/office/drawing/2016/ink" xmlns:am3d="http://schemas.microsoft.com/office/drawing/2017/model3d" xmlns:o="urn:schemas-microsoft-com:office:office" xmlns:r="http://schemas.openxmlformats.org/officeDocument/2006/relationships" xmlns:m="http://schemas.openxmlformats.org/officeDocument/2006/math" xmlns:v="urn:schemas-microsoft-com:vml" xmlns:wp14="http://schemas.microsoft.com/office/word/2010/wordprocessingDrawing" xmlns:wp="http://schemas.openxmlformats.org/drawingml/2006/wordprocessingDrawing" xmlns:w10="urn:schemas-microsoft-com:office:word" xmlns:w="http://schemas.openxmlformats.org/wordprocessingml/2006/main" xmlns:w14="http://schemas.microsoft.com/office/word/2010/wordml" xmlns:w15="http://schemas.microsoft.com/office/word/2012/wordml" xmlns:w16cex="http://schemas.microsoft.com/office/word/2018/wordml/cex" xmlns:w16cid="http://schemas.microsoft.com/office/word/2016/wordml/cid" xmlns:w16="http://schemas.microsoft.com/office/word/2018/wordml" xmlns:w16sdtdh="http://schemas.microsoft.com/office/word/2020/wordml/sdtdatahash" xmlns:w16se="http://schemas.microsoft.com/office/word/2015/wordml/symex" xmlns:wpg="http://schemas.microsoft.com/office/word/2010/wordprocessingGroup" xmlns:wpi="http://schemas.microsoft.com/office/word/2010/wordprocessingInk" xmlns:wne="http://schemas.microsoft.com/office/word/2006/wordml" xmlns:wps="http://schemas.microsoft.com/office/word/2010/wordprocessingShape" mc:Ignorable="w14 w15 w16se w16cid w16 w16cex w16sdtdh wp14">
   <w:p>
     <w:pPr>
       <w:pStyle w:val="Footer"/>
@@ -2156,7 +1815,7 @@
 </file>
 
 <file path=word/footnotes.xml><?xml version="1.0" encoding="utf-8"?>
-<w:footnotes xmlns:wpc="http://schemas.microsoft.com/office/word/2010/wordprocessingCanvas" xmlns:mc="http://schemas.openxmlformats.org/markup-compatibility/2006" xmlns:o="urn:schemas-microsoft-com:office:office" xmlns:r="http://schemas.openxmlformats.org/officeDocument/2006/relationships" xmlns:m="http://schemas.openxmlformats.org/officeDocument/2006/math" xmlns:v="urn:schemas-microsoft-com:vml" xmlns:wp14="http://schemas.microsoft.com/office/word/2010/wordprocessingDrawing" xmlns:wp="http://schemas.openxmlformats.org/drawingml/2006/wordprocessingDrawing" xmlns:w10="urn:schemas-microsoft-com:office:word" xmlns:w="http://schemas.openxmlformats.org/wordprocessingml/2006/main" xmlns:w14="http://schemas.microsoft.com/office/word/2010/wordml" xmlns:wpg="http://schemas.microsoft.com/office/word/2010/wordprocessingGroup" xmlns:wpi="http://schemas.microsoft.com/office/word/2010/wordprocessingInk" xmlns:wne="http://schemas.microsoft.com/office/word/2006/wordml" xmlns:wps="http://schemas.microsoft.com/office/word/2010/wordprocessingShape" mc:Ignorable="w14 wp14">
+<w:footnotes xmlns:wpc="http://schemas.microsoft.com/office/word/2010/wordprocessingCanvas" xmlns:cx="http://schemas.microsoft.com/office/drawing/2014/chartex" xmlns:cx1="http://schemas.microsoft.com/office/drawing/2015/9/8/chartex" xmlns:cx2="http://schemas.microsoft.com/office/drawing/2015/10/21/chartex" xmlns:cx3="http://schemas.microsoft.com/office/drawing/2016/5/9/chartex" xmlns:cx4="http://schemas.microsoft.com/office/drawing/2016/5/10/chartex" xmlns:cx5="http://schemas.microsoft.com/office/drawing/2016/5/11/chartex" xmlns:cx6="http://schemas.microsoft.com/office/drawing/2016/5/12/chartex" xmlns:cx7="http://schemas.microsoft.com/office/drawing/2016/5/13/chartex" xmlns:cx8="http://schemas.microsoft.com/office/drawing/2016/5/14/chartex" xmlns:mc="http://schemas.openxmlformats.org/markup-compatibility/2006" xmlns:aink="http://schemas.microsoft.com/office/drawing/2016/ink" xmlns:am3d="http://schemas.microsoft.com/office/drawing/2017/model3d" xmlns:o="urn:schemas-microsoft-com:office:office" xmlns:r="http://schemas.openxmlformats.org/officeDocument/2006/relationships" xmlns:m="http://schemas.openxmlformats.org/officeDocument/2006/math" xmlns:v="urn:schemas-microsoft-com:vml" xmlns:wp14="http://schemas.microsoft.com/office/word/2010/wordprocessingDrawing" xmlns:wp="http://schemas.openxmlformats.org/drawingml/2006/wordprocessingDrawing" xmlns:w10="urn:schemas-microsoft-com:office:word" xmlns:w="http://schemas.openxmlformats.org/wordprocessingml/2006/main" xmlns:w14="http://schemas.microsoft.com/office/word/2010/wordml" xmlns:w15="http://schemas.microsoft.com/office/word/2012/wordml" xmlns:w16cex="http://schemas.microsoft.com/office/word/2018/wordml/cex" xmlns:w16cid="http://schemas.microsoft.com/office/word/2016/wordml/cid" xmlns:w16="http://schemas.microsoft.com/office/word/2018/wordml" xmlns:w16sdtdh="http://schemas.microsoft.com/office/word/2020/wordml/sdtdatahash" xmlns:w16se="http://schemas.microsoft.com/office/word/2015/wordml/symex" xmlns:wpg="http://schemas.microsoft.com/office/word/2010/wordprocessingGroup" xmlns:wpi="http://schemas.microsoft.com/office/word/2010/wordprocessingInk" xmlns:wne="http://schemas.microsoft.com/office/word/2006/wordml" xmlns:wps="http://schemas.microsoft.com/office/word/2010/wordprocessingShape" mc:Ignorable="w14 w15 w16se w16cid w16 w16cex w16sdtdh wp14">
   <w:footnote w:type="separator" w:id="-1">
     <w:p>
       <w:r>
@@ -2175,7 +1834,7 @@
 </file>
 
 <file path=word/header1.xml><?xml version="1.0" encoding="utf-8"?>
-<w:hdr xmlns:wpc="http://schemas.microsoft.com/office/word/2010/wordprocessingCanvas" xmlns:mc="http://schemas.openxmlformats.org/markup-compatibility/2006" xmlns:o="urn:schemas-microsoft-com:office:office" xmlns:r="http://schemas.openxmlformats.org/officeDocument/2006/relationships" xmlns:m="http://schemas.openxmlformats.org/officeDocument/2006/math" xmlns:v="urn:schemas-microsoft-com:vml" xmlns:wp14="http://schemas.microsoft.com/office/word/2010/wordprocessingDrawing" xmlns:wp="http://schemas.openxmlformats.org/drawingml/2006/wordprocessingDrawing" xmlns:w10="urn:schemas-microsoft-com:office:word" xmlns:w="http://schemas.openxmlformats.org/wordprocessingml/2006/main" xmlns:w14="http://schemas.microsoft.com/office/word/2010/wordml" xmlns:wpg="http://schemas.microsoft.com/office/word/2010/wordprocessingGroup" xmlns:wpi="http://schemas.microsoft.com/office/word/2010/wordprocessingInk" xmlns:wne="http://schemas.microsoft.com/office/word/2006/wordml" xmlns:wps="http://schemas.microsoft.com/office/word/2010/wordprocessingShape" mc:Ignorable="w14 wp14">
+<w:hdr xmlns:wpc="http://schemas.microsoft.com/office/word/2010/wordprocessingCanvas" xmlns:cx="http://schemas.microsoft.com/office/drawing/2014/chartex" xmlns:cx1="http://schemas.microsoft.com/office/drawing/2015/9/8/chartex" xmlns:cx2="http://schemas.microsoft.com/office/drawing/2015/10/21/chartex" xmlns:cx3="http://schemas.microsoft.com/office/drawing/2016/5/9/chartex" xmlns:cx4="http://schemas.microsoft.com/office/drawing/2016/5/10/chartex" xmlns:cx5="http://schemas.microsoft.com/office/drawing/2016/5/11/chartex" xmlns:cx6="http://schemas.microsoft.com/office/drawing/2016/5/12/chartex" xmlns:cx7="http://schemas.microsoft.com/office/drawing/2016/5/13/chartex" xmlns:cx8="http://schemas.microsoft.com/office/drawing/2016/5/14/chartex" xmlns:mc="http://schemas.openxmlformats.org/markup-compatibility/2006" xmlns:aink="http://schemas.microsoft.com/office/drawing/2016/ink" xmlns:am3d="http://schemas.microsoft.com/office/drawing/2017/model3d" xmlns:o="urn:schemas-microsoft-com:office:office" xmlns:r="http://schemas.openxmlformats.org/officeDocument/2006/relationships" xmlns:m="http://schemas.openxmlformats.org/officeDocument/2006/math" xmlns:v="urn:schemas-microsoft-com:vml" xmlns:wp14="http://schemas.microsoft.com/office/word/2010/wordprocessingDrawing" xmlns:wp="http://schemas.openxmlformats.org/drawingml/2006/wordprocessingDrawing" xmlns:w10="urn:schemas-microsoft-com:office:word" xmlns:w="http://schemas.openxmlformats.org/wordprocessingml/2006/main" xmlns:w14="http://schemas.microsoft.com/office/word/2010/wordml" xmlns:w15="http://schemas.microsoft.com/office/word/2012/wordml" xmlns:w16cex="http://schemas.microsoft.com/office/word/2018/wordml/cex" xmlns:w16cid="http://schemas.microsoft.com/office/word/2016/wordml/cid" xmlns:w16="http://schemas.microsoft.com/office/word/2018/wordml" xmlns:w16sdtdh="http://schemas.microsoft.com/office/word/2020/wordml/sdtdatahash" xmlns:w16se="http://schemas.microsoft.com/office/word/2015/wordml/symex" xmlns:wpg="http://schemas.microsoft.com/office/word/2010/wordprocessingGroup" xmlns:wpi="http://schemas.microsoft.com/office/word/2010/wordprocessingInk" xmlns:wne="http://schemas.microsoft.com/office/word/2006/wordml" xmlns:wps="http://schemas.microsoft.com/office/word/2010/wordprocessingShape" mc:Ignorable="w14 w15 w16se w16cid w16 w16cex w16sdtdh wp14">
   <w:p>
     <w:pPr>
       <w:pStyle w:val="Header"/>
@@ -2185,7 +1844,7 @@
 </file>
 
 <file path=word/header2.xml><?xml version="1.0" encoding="utf-8"?>
-<w:hdr xmlns:wpc="http://schemas.microsoft.com/office/word/2010/wordprocessingCanvas" xmlns:mc="http://schemas.openxmlformats.org/markup-compatibility/2006" xmlns:o="urn:schemas-microsoft-com:office:office" xmlns:r="http://schemas.openxmlformats.org/officeDocument/2006/relationships" xmlns:m="http://schemas.openxmlformats.org/officeDocument/2006/math" xmlns:v="urn:schemas-microsoft-com:vml" xmlns:wp14="http://schemas.microsoft.com/office/word/2010/wordprocessingDrawing" xmlns:wp="http://schemas.openxmlformats.org/drawingml/2006/wordprocessingDrawing" xmlns:w10="urn:schemas-microsoft-com:office:word" xmlns:w="http://schemas.openxmlformats.org/wordprocessingml/2006/main" xmlns:w14="http://schemas.microsoft.com/office/word/2010/wordml" xmlns:wpg="http://schemas.microsoft.com/office/word/2010/wordprocessingGroup" xmlns:wpi="http://schemas.microsoft.com/office/word/2010/wordprocessingInk" xmlns:wne="http://schemas.microsoft.com/office/word/2006/wordml" xmlns:wps="http://schemas.microsoft.com/office/word/2010/wordprocessingShape" mc:Ignorable="w14 wp14">
+<w:hdr xmlns:wpc="http://schemas.microsoft.com/office/word/2010/wordprocessingCanvas" xmlns:cx="http://schemas.microsoft.com/office/drawing/2014/chartex" xmlns:cx1="http://schemas.microsoft.com/office/drawing/2015/9/8/chartex" xmlns:cx2="http://schemas.microsoft.com/office/drawing/2015/10/21/chartex" xmlns:cx3="http://schemas.microsoft.com/office/drawing/2016/5/9/chartex" xmlns:cx4="http://schemas.microsoft.com/office/drawing/2016/5/10/chartex" xmlns:cx5="http://schemas.microsoft.com/office/drawing/2016/5/11/chartex" xmlns:cx6="http://schemas.microsoft.com/office/drawing/2016/5/12/chartex" xmlns:cx7="http://schemas.microsoft.com/office/drawing/2016/5/13/chartex" xmlns:cx8="http://schemas.microsoft.com/office/drawing/2016/5/14/chartex" xmlns:mc="http://schemas.openxmlformats.org/markup-compatibility/2006" xmlns:aink="http://schemas.microsoft.com/office/drawing/2016/ink" xmlns:am3d="http://schemas.microsoft.com/office/drawing/2017/model3d" xmlns:o="urn:schemas-microsoft-com:office:office" xmlns:r="http://schemas.openxmlformats.org/officeDocument/2006/relationships" xmlns:m="http://schemas.openxmlformats.org/officeDocument/2006/math" xmlns:v="urn:schemas-microsoft-com:vml" xmlns:wp14="http://schemas.microsoft.com/office/word/2010/wordprocessingDrawing" xmlns:wp="http://schemas.openxmlformats.org/drawingml/2006/wordprocessingDrawing" xmlns:w10="urn:schemas-microsoft-com:office:word" xmlns:w="http://schemas.openxmlformats.org/wordprocessingml/2006/main" xmlns:w14="http://schemas.microsoft.com/office/word/2010/wordml" xmlns:w15="http://schemas.microsoft.com/office/word/2012/wordml" xmlns:w16cex="http://schemas.microsoft.com/office/word/2018/wordml/cex" xmlns:w16cid="http://schemas.microsoft.com/office/word/2016/wordml/cid" xmlns:w16="http://schemas.microsoft.com/office/word/2018/wordml" xmlns:w16sdtdh="http://schemas.microsoft.com/office/word/2020/wordml/sdtdatahash" xmlns:w16se="http://schemas.microsoft.com/office/word/2015/wordml/symex" xmlns:wpg="http://schemas.microsoft.com/office/word/2010/wordprocessingGroup" xmlns:wpi="http://schemas.microsoft.com/office/word/2010/wordprocessingInk" xmlns:wne="http://schemas.microsoft.com/office/word/2006/wordml" xmlns:wps="http://schemas.microsoft.com/office/word/2010/wordprocessingShape" mc:Ignorable="w14 w15 w16se w16cid w16 w16cex w16sdtdh wp14">
   <w:p>
     <w:pPr>
       <w:pStyle w:val="Header"/>
@@ -2282,27 +1941,7 @@
                               <w:sz w:val="16"/>
                               <w:szCs w:val="16"/>
                             </w:rPr>
-                            <w:t xml:space="preserve">PU-4, Scheme No. 54, Behind </w:t>
-                          </w:r>
-                          <w:proofErr w:type="spellStart"/>
-                          <w:r>
-                            <w:rPr>
-                              <w:rFonts w:ascii="Tahoma" w:eastAsia="Times New Roman" w:hAnsi="Tahoma" w:cs="Tahoma"/>
-                              <w:color w:val="003366"/>
-                              <w:sz w:val="16"/>
-                              <w:szCs w:val="16"/>
-                            </w:rPr>
-                            <w:t>Mangal</w:t>
-                          </w:r>
-                          <w:proofErr w:type="spellEnd"/>
-                          <w:r>
-                            <w:rPr>
-                              <w:rFonts w:ascii="Tahoma" w:eastAsia="Times New Roman" w:hAnsi="Tahoma" w:cs="Tahoma"/>
-                              <w:color w:val="003366"/>
-                              <w:sz w:val="16"/>
-                              <w:szCs w:val="16"/>
-                            </w:rPr>
-                            <w:t xml:space="preserve"> City, Vijay Nagar,</w:t>
+                            <w:t>PU-4, Scheme No. 54, Behind Mangal City, Vijay Nagar,</w:t>
                           </w:r>
                         </w:p>
                         <w:p>
@@ -2315,7 +1954,6 @@
                               <w:szCs w:val="16"/>
                             </w:rPr>
                           </w:pPr>
-                          <w:proofErr w:type="gramStart"/>
                           <w:r>
                             <w:rPr>
                               <w:rFonts w:ascii="Tahoma" w:eastAsia="Times New Roman" w:hAnsi="Tahoma" w:cs="Tahoma"/>
@@ -2325,7 +1963,6 @@
                             </w:rPr>
                             <w:t>Indore – 452010, Madhya Pradesh, India.</w:t>
                           </w:r>
-                          <w:proofErr w:type="gramEnd"/>
                         </w:p>
                         <w:p>
                           <w:pPr>
@@ -2389,7 +2026,6 @@
                               <w:szCs w:val="16"/>
                             </w:rPr>
                           </w:pPr>
-                          <w:proofErr w:type="gramStart"/>
                           <w:r>
                             <w:rPr>
                               <w:rFonts w:ascii="Tahoma" w:eastAsia="Times New Roman" w:hAnsi="Tahoma" w:cs="Tahoma"/>
@@ -2397,17 +2033,7 @@
                               <w:sz w:val="16"/>
                               <w:szCs w:val="16"/>
                             </w:rPr>
-                            <w:t>Website :</w:t>
-                          </w:r>
-                          <w:proofErr w:type="gramEnd"/>
-                          <w:r>
-                            <w:rPr>
-                              <w:rFonts w:ascii="Tahoma" w:eastAsia="Times New Roman" w:hAnsi="Tahoma" w:cs="Tahoma"/>
-                              <w:color w:val="003366"/>
-                              <w:sz w:val="16"/>
-                              <w:szCs w:val="16"/>
-                            </w:rPr>
-                            <w:t> </w:t>
+                            <w:t>Website : </w:t>
                           </w:r>
                           <w:hyperlink r:id="rId2" w:tgtFrame="_blank" w:history="1">
                             <w:r>
@@ -2456,7 +2082,7 @@
         </mc:Choice>
         <mc:Fallback>
           <w:pict>
-            <v:rect id="Rectangle 10" o:spid="_x0000_s1028" style="position:absolute;margin-left:627.95pt;margin-top:3.8pt;width:216.7pt;height:69.75pt;z-index:251659264;visibility:visible;mso-wrap-style:square;mso-width-percent:0;mso-height-percent:0;mso-wrap-distance-left:9pt;mso-wrap-distance-top:0;mso-wrap-distance-right:9pt;mso-wrap-distance-bottom:0;mso-position-horizontal:absolute;mso-position-horizontal-relative:text;mso-position-vertical:absolute;mso-position-vertical-relative:text;mso-width-percent:0;mso-height-percent:0;mso-width-relative:margin;mso-height-relative:margin;v-text-anchor:middle" o:gfxdata="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" fillcolor="white [3201]" strokecolor="white [3212]" strokeweight="1pt">
+            <v:rect w14:anchorId="161BE7F2" id="Rectangle 10" o:spid="_x0000_s1028" style="position:absolute;margin-left:627.95pt;margin-top:3.8pt;width:216.7pt;height:69.75pt;z-index:251659264;visibility:visible;mso-wrap-style:square;mso-width-percent:0;mso-height-percent:0;mso-wrap-distance-left:9pt;mso-wrap-distance-top:0;mso-wrap-distance-right:9pt;mso-wrap-distance-bottom:0;mso-position-horizontal:absolute;mso-position-horizontal-relative:text;mso-position-vertical:absolute;mso-position-vertical-relative:text;mso-width-percent:0;mso-height-percent:0;mso-width-relative:margin;mso-height-relative:margin;v-text-anchor:middle" o:gfxdata="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" fillcolor="white [3201]" strokecolor="white [3212]" strokeweight="1pt">
               <v:textbox>
                 <w:txbxContent>
                   <w:p>
@@ -2496,27 +2122,7 @@
                         <w:sz w:val="16"/>
                         <w:szCs w:val="16"/>
                       </w:rPr>
-                      <w:t xml:space="preserve">PU-4, Scheme No. 54, Behind </w:t>
-                    </w:r>
-                    <w:proofErr w:type="spellStart"/>
-                    <w:r>
-                      <w:rPr>
-                        <w:rFonts w:ascii="Tahoma" w:eastAsia="Times New Roman" w:hAnsi="Tahoma" w:cs="Tahoma"/>
-                        <w:color w:val="003366"/>
-                        <w:sz w:val="16"/>
-                        <w:szCs w:val="16"/>
-                      </w:rPr>
-                      <w:t>Mangal</w:t>
-                    </w:r>
-                    <w:proofErr w:type="spellEnd"/>
-                    <w:r>
-                      <w:rPr>
-                        <w:rFonts w:ascii="Tahoma" w:eastAsia="Times New Roman" w:hAnsi="Tahoma" w:cs="Tahoma"/>
-                        <w:color w:val="003366"/>
-                        <w:sz w:val="16"/>
-                        <w:szCs w:val="16"/>
-                      </w:rPr>
-                      <w:t xml:space="preserve"> City, Vijay Nagar,</w:t>
+                      <w:t>PU-4, Scheme No. 54, Behind Mangal City, Vijay Nagar,</w:t>
                     </w:r>
                   </w:p>
                   <w:p>
@@ -2529,7 +2135,6 @@
                         <w:szCs w:val="16"/>
                       </w:rPr>
                     </w:pPr>
-                    <w:proofErr w:type="gramStart"/>
                     <w:r>
                       <w:rPr>
                         <w:rFonts w:ascii="Tahoma" w:eastAsia="Times New Roman" w:hAnsi="Tahoma" w:cs="Tahoma"/>
@@ -2539,7 +2144,6 @@
                       </w:rPr>
                       <w:t>Indore – 452010, Madhya Pradesh, India.</w:t>
                     </w:r>
-                    <w:proofErr w:type="gramEnd"/>
                   </w:p>
                   <w:p>
                     <w:pPr>
@@ -2603,7 +2207,6 @@
                         <w:szCs w:val="16"/>
                       </w:rPr>
                     </w:pPr>
-                    <w:proofErr w:type="gramStart"/>
                     <w:r>
                       <w:rPr>
                         <w:rFonts w:ascii="Tahoma" w:eastAsia="Times New Roman" w:hAnsi="Tahoma" w:cs="Tahoma"/>
@@ -2611,17 +2214,7 @@
                         <w:sz w:val="16"/>
                         <w:szCs w:val="16"/>
                       </w:rPr>
-                      <w:t>Website :</w:t>
-                    </w:r>
-                    <w:proofErr w:type="gramEnd"/>
-                    <w:r>
-                      <w:rPr>
-                        <w:rFonts w:ascii="Tahoma" w:eastAsia="Times New Roman" w:hAnsi="Tahoma" w:cs="Tahoma"/>
-                        <w:color w:val="003366"/>
-                        <w:sz w:val="16"/>
-                        <w:szCs w:val="16"/>
-                      </w:rPr>
-                      <w:t> </w:t>
+                      <w:t>Website : </w:t>
                     </w:r>
                     <w:hyperlink r:id="rId4" w:tgtFrame="_blank" w:history="1">
                       <w:r>
@@ -2712,7 +2305,7 @@
 </file>
 
 <file path=word/header3.xml><?xml version="1.0" encoding="utf-8"?>
-<w:hdr xmlns:wpc="http://schemas.microsoft.com/office/word/2010/wordprocessingCanvas" xmlns:mc="http://schemas.openxmlformats.org/markup-compatibility/2006" xmlns:o="urn:schemas-microsoft-com:office:office" xmlns:r="http://schemas.openxmlformats.org/officeDocument/2006/relationships" xmlns:m="http://schemas.openxmlformats.org/officeDocument/2006/math" xmlns:v="urn:schemas-microsoft-com:vml" xmlns:wp14="http://schemas.microsoft.com/office/word/2010/wordprocessingDrawing" xmlns:wp="http://schemas.openxmlformats.org/drawingml/2006/wordprocessingDrawing" xmlns:w10="urn:schemas-microsoft-com:office:word" xmlns:w="http://schemas.openxmlformats.org/wordprocessingml/2006/main" xmlns:w14="http://schemas.microsoft.com/office/word/2010/wordml" xmlns:wpg="http://schemas.microsoft.com/office/word/2010/wordprocessingGroup" xmlns:wpi="http://schemas.microsoft.com/office/word/2010/wordprocessingInk" xmlns:wne="http://schemas.microsoft.com/office/word/2006/wordml" xmlns:wps="http://schemas.microsoft.com/office/word/2010/wordprocessingShape" mc:Ignorable="w14 wp14">
+<w:hdr xmlns:wpc="http://schemas.microsoft.com/office/word/2010/wordprocessingCanvas" xmlns:cx="http://schemas.microsoft.com/office/drawing/2014/chartex" xmlns:cx1="http://schemas.microsoft.com/office/drawing/2015/9/8/chartex" xmlns:cx2="http://schemas.microsoft.com/office/drawing/2015/10/21/chartex" xmlns:cx3="http://schemas.microsoft.com/office/drawing/2016/5/9/chartex" xmlns:cx4="http://schemas.microsoft.com/office/drawing/2016/5/10/chartex" xmlns:cx5="http://schemas.microsoft.com/office/drawing/2016/5/11/chartex" xmlns:cx6="http://schemas.microsoft.com/office/drawing/2016/5/12/chartex" xmlns:cx7="http://schemas.microsoft.com/office/drawing/2016/5/13/chartex" xmlns:cx8="http://schemas.microsoft.com/office/drawing/2016/5/14/chartex" xmlns:mc="http://schemas.openxmlformats.org/markup-compatibility/2006" xmlns:aink="http://schemas.microsoft.com/office/drawing/2016/ink" xmlns:am3d="http://schemas.microsoft.com/office/drawing/2017/model3d" xmlns:o="urn:schemas-microsoft-com:office:office" xmlns:r="http://schemas.openxmlformats.org/officeDocument/2006/relationships" xmlns:m="http://schemas.openxmlformats.org/officeDocument/2006/math" xmlns:v="urn:schemas-microsoft-com:vml" xmlns:wp14="http://schemas.microsoft.com/office/word/2010/wordprocessingDrawing" xmlns:wp="http://schemas.openxmlformats.org/drawingml/2006/wordprocessingDrawing" xmlns:w10="urn:schemas-microsoft-com:office:word" xmlns:w="http://schemas.openxmlformats.org/wordprocessingml/2006/main" xmlns:w14="http://schemas.microsoft.com/office/word/2010/wordml" xmlns:w15="http://schemas.microsoft.com/office/word/2012/wordml" xmlns:w16cex="http://schemas.microsoft.com/office/word/2018/wordml/cex" xmlns:w16cid="http://schemas.microsoft.com/office/word/2016/wordml/cid" xmlns:w16="http://schemas.microsoft.com/office/word/2018/wordml" xmlns:w16sdtdh="http://schemas.microsoft.com/office/word/2020/wordml/sdtdatahash" xmlns:w16se="http://schemas.microsoft.com/office/word/2015/wordml/symex" xmlns:wpg="http://schemas.microsoft.com/office/word/2010/wordprocessingGroup" xmlns:wpi="http://schemas.microsoft.com/office/word/2010/wordprocessingInk" xmlns:wne="http://schemas.microsoft.com/office/word/2006/wordml" xmlns:wps="http://schemas.microsoft.com/office/word/2010/wordprocessingShape" mc:Ignorable="w14 w15 w16se w16cid w16 w16cex w16sdtdh wp14">
   <w:p>
     <w:pPr>
       <w:pStyle w:val="Header"/>
@@ -2722,8 +2315,8 @@
 </file>
 
 <file path=word/numbering.xml><?xml version="1.0" encoding="utf-8"?>
-<w:numbering xmlns:wpc="http://schemas.microsoft.com/office/word/2010/wordprocessingCanvas" xmlns:mc="http://schemas.openxmlformats.org/markup-compatibility/2006" xmlns:o="urn:schemas-microsoft-com:office:office" xmlns:r="http://schemas.openxmlformats.org/officeDocument/2006/relationships" xmlns:m="http://schemas.openxmlformats.org/officeDocument/2006/math" xmlns:v="urn:schemas-microsoft-com:vml" xmlns:wp14="http://schemas.microsoft.com/office/word/2010/wordprocessingDrawing" xmlns:wp="http://schemas.openxmlformats.org/drawingml/2006/wordprocessingDrawing" xmlns:w10="urn:schemas-microsoft-com:office:word" xmlns:w="http://schemas.openxmlformats.org/wordprocessingml/2006/main" xmlns:w14="http://schemas.microsoft.com/office/word/2010/wordml" xmlns:wpg="http://schemas.microsoft.com/office/word/2010/wordprocessingGroup" xmlns:wpi="http://schemas.microsoft.com/office/word/2010/wordprocessingInk" xmlns:wne="http://schemas.microsoft.com/office/word/2006/wordml" xmlns:wps="http://schemas.microsoft.com/office/word/2010/wordprocessingShape" mc:Ignorable="w14 wp14">
-  <w:abstractNum w:abstractNumId="0">
+<w:numbering xmlns:wpc="http://schemas.microsoft.com/office/word/2010/wordprocessingCanvas" xmlns:cx="http://schemas.microsoft.com/office/drawing/2014/chartex" xmlns:cx1="http://schemas.microsoft.com/office/drawing/2015/9/8/chartex" xmlns:cx2="http://schemas.microsoft.com/office/drawing/2015/10/21/chartex" xmlns:cx3="http://schemas.microsoft.com/office/drawing/2016/5/9/chartex" xmlns:cx4="http://schemas.microsoft.com/office/drawing/2016/5/10/chartex" xmlns:cx5="http://schemas.microsoft.com/office/drawing/2016/5/11/chartex" xmlns:cx6="http://schemas.microsoft.com/office/drawing/2016/5/12/chartex" xmlns:cx7="http://schemas.microsoft.com/office/drawing/2016/5/13/chartex" xmlns:cx8="http://schemas.microsoft.com/office/drawing/2016/5/14/chartex" xmlns:mc="http://schemas.openxmlformats.org/markup-compatibility/2006" xmlns:aink="http://schemas.microsoft.com/office/drawing/2016/ink" xmlns:am3d="http://schemas.microsoft.com/office/drawing/2017/model3d" xmlns:o="urn:schemas-microsoft-com:office:office" xmlns:r="http://schemas.openxmlformats.org/officeDocument/2006/relationships" xmlns:m="http://schemas.openxmlformats.org/officeDocument/2006/math" xmlns:v="urn:schemas-microsoft-com:vml" xmlns:wp14="http://schemas.microsoft.com/office/word/2010/wordprocessingDrawing" xmlns:wp="http://schemas.openxmlformats.org/drawingml/2006/wordprocessingDrawing" xmlns:w10="urn:schemas-microsoft-com:office:word" xmlns:w="http://schemas.openxmlformats.org/wordprocessingml/2006/main" xmlns:w14="http://schemas.microsoft.com/office/word/2010/wordml" xmlns:w15="http://schemas.microsoft.com/office/word/2012/wordml" xmlns:w16cex="http://schemas.microsoft.com/office/word/2018/wordml/cex" xmlns:w16cid="http://schemas.microsoft.com/office/word/2016/wordml/cid" xmlns:w16="http://schemas.microsoft.com/office/word/2018/wordml" xmlns:w16sdtdh="http://schemas.microsoft.com/office/word/2020/wordml/sdtdatahash" xmlns:w16se="http://schemas.microsoft.com/office/word/2015/wordml/symex" xmlns:wpg="http://schemas.microsoft.com/office/word/2010/wordprocessingGroup" xmlns:wpi="http://schemas.microsoft.com/office/word/2010/wordprocessingInk" xmlns:wne="http://schemas.microsoft.com/office/word/2006/wordml" xmlns:wps="http://schemas.microsoft.com/office/word/2010/wordprocessingShape" mc:Ignorable="w14 w15 w16se w16cid w16 w16cex w16sdtdh wp14">
+  <w:abstractNum w:abstractNumId="0" w15:restartNumberingAfterBreak="0">
     <w:nsid w:val="19365752"/>
     <w:multiLevelType w:val="hybridMultilevel"/>
     <w:tmpl w:val="DFA0A576"/>
@@ -2812,7 +2405,7 @@
       </w:pPr>
     </w:lvl>
   </w:abstractNum>
-  <w:abstractNum w:abstractNumId="1">
+  <w:abstractNum w:abstractNumId="1" w15:restartNumberingAfterBreak="0">
     <w:nsid w:val="19495CFF"/>
     <w:multiLevelType w:val="hybridMultilevel"/>
     <w:tmpl w:val="79CC075A"/>
@@ -2863,7 +2456,7 @@
       <w:lvlJc w:val="left"/>
     </w:lvl>
   </w:abstractNum>
-  <w:abstractNum w:abstractNumId="2">
+  <w:abstractNum w:abstractNumId="2" w15:restartNumberingAfterBreak="0">
     <w:nsid w:val="66334873"/>
     <w:multiLevelType w:val="hybridMultilevel"/>
     <w:tmpl w:val="71B6F7D8"/>
@@ -2914,7 +2507,7 @@
       <w:lvlJc w:val="left"/>
     </w:lvl>
   </w:abstractNum>
-  <w:abstractNum w:abstractNumId="3">
+  <w:abstractNum w:abstractNumId="3" w15:restartNumberingAfterBreak="0">
     <w:nsid w:val="74B0DC51"/>
     <w:multiLevelType w:val="hybridMultilevel"/>
     <w:tmpl w:val="22FA3D1C"/>
@@ -2981,7 +2574,7 @@
 </file>
 
 <file path=word/styles.xml><?xml version="1.0" encoding="utf-8"?>
-<w:styles xmlns:mc="http://schemas.openxmlformats.org/markup-compatibility/2006" xmlns:r="http://schemas.openxmlformats.org/officeDocument/2006/relationships" xmlns:w="http://schemas.openxmlformats.org/wordprocessingml/2006/main" xmlns:w14="http://schemas.microsoft.com/office/word/2010/wordml" mc:Ignorable="w14">
+<w:styles xmlns:mc="http://schemas.openxmlformats.org/markup-compatibility/2006" xmlns:r="http://schemas.openxmlformats.org/officeDocument/2006/relationships" xmlns:w="http://schemas.openxmlformats.org/wordprocessingml/2006/main" xmlns:w14="http://schemas.microsoft.com/office/word/2010/wordml" xmlns:w15="http://schemas.microsoft.com/office/word/2012/wordml" xmlns:w16cex="http://schemas.microsoft.com/office/word/2018/wordml/cex" xmlns:w16cid="http://schemas.microsoft.com/office/word/2016/wordml/cid" xmlns:w16="http://schemas.microsoft.com/office/word/2018/wordml" xmlns:w16sdtdh="http://schemas.microsoft.com/office/word/2020/wordml/sdtdatahash" xmlns:w16se="http://schemas.microsoft.com/office/word/2015/wordml/symex" mc:Ignorable="w14 w15 w16se w16cid w16 w16cex w16sdtdh">
   <w:docDefaults>
     <w:rPrDefault>
       <w:rPr>
@@ -2993,496 +2586,383 @@
     </w:rPrDefault>
     <w:pPrDefault/>
   </w:docDefaults>
-  <w:latentStyles w:defLockedState="0" w:defUIPriority="99" w:defSemiHidden="1" w:defUnhideWhenUsed="1" w:defQFormat="0" w:count="267">
-    <w:lsdException w:name="Normal" w:semiHidden="0" w:uiPriority="0" w:unhideWhenUsed="0" w:qFormat="1"/>
-    <w:lsdException w:name="heading 1" w:semiHidden="0" w:uiPriority="9" w:unhideWhenUsed="0" w:qFormat="1"/>
-    <w:lsdException w:name="heading 2" w:uiPriority="9" w:qFormat="1"/>
-    <w:lsdException w:name="heading 3" w:uiPriority="9" w:qFormat="1"/>
-    <w:lsdException w:name="heading 4" w:uiPriority="9" w:qFormat="1"/>
-    <w:lsdException w:name="heading 5" w:uiPriority="9" w:qFormat="1"/>
-    <w:lsdException w:name="heading 6" w:uiPriority="9" w:qFormat="1"/>
-    <w:lsdException w:name="heading 7" w:uiPriority="9" w:qFormat="1"/>
-    <w:lsdException w:name="heading 8" w:uiPriority="9" w:qFormat="1"/>
-    <w:lsdException w:name="heading 9" w:uiPriority="9" w:qFormat="1"/>
-    <w:lsdException w:name="toc 1" w:uiPriority="39"/>
-    <w:lsdException w:name="toc 2" w:uiPriority="39"/>
-    <w:lsdException w:name="toc 3" w:uiPriority="39"/>
-    <w:lsdException w:name="toc 4" w:uiPriority="39"/>
-    <w:lsdException w:name="toc 5" w:uiPriority="39"/>
-    <w:lsdException w:name="toc 6" w:uiPriority="39"/>
-    <w:lsdException w:name="toc 7" w:uiPriority="39"/>
-    <w:lsdException w:name="toc 8" w:uiPriority="39"/>
-    <w:lsdException w:name="toc 9" w:uiPriority="39"/>
-    <w:lsdException w:name="caption" w:uiPriority="35" w:qFormat="1"/>
-    <w:lsdException w:name="Title" w:semiHidden="0" w:uiPriority="10" w:unhideWhenUsed="0" w:qFormat="1"/>
-    <w:lsdException w:name="Default Paragraph Font" w:uiPriority="1"/>
-    <w:lsdException w:name="Subtitle" w:semiHidden="0" w:uiPriority="11" w:unhideWhenUsed="0" w:qFormat="1"/>
-    <w:lsdException w:name="Strong" w:semiHidden="0" w:uiPriority="22" w:unhideWhenUsed="0" w:qFormat="1"/>
-    <w:lsdException w:name="Emphasis" w:semiHidden="0" w:uiPriority="20" w:unhideWhenUsed="0" w:qFormat="1"/>
-    <w:lsdException w:name="Table Grid" w:semiHidden="0" w:uiPriority="39" w:unhideWhenUsed="0"/>
-    <w:lsdException w:name="Placeholder Text" w:unhideWhenUsed="0"/>
-    <w:lsdException w:name="No Spacing" w:semiHidden="0" w:uiPriority="1" w:unhideWhenUsed="0" w:qFormat="1"/>
-    <w:lsdException w:name="Light Shading" w:semiHidden="0" w:uiPriority="60" w:unhideWhenUsed="0"/>
-    <w:lsdException w:name="Light List" w:semiHidden="0" w:uiPriority="61" w:unhideWhenUsed="0"/>
-    <w:lsdException w:name="Light Grid" w:semiHidden="0" w:uiPriority="62" w:unhideWhenUsed="0"/>
-    <w:lsdException w:name="Medium Shading 1" w:semiHidden="0" w:uiPriority="63" w:unhideWhenUsed="0"/>
-    <w:lsdException w:name="Medium Shading 2" w:semiHidden="0" w:uiPriority="64" w:unhideWhenUsed="0"/>
-    <w:lsdException w:name="Medium List 1" w:semiHidden="0" w:uiPriority="65" w:unhideWhenUsed="0"/>
-    <w:lsdException w:name="Medium List 2" w:semiHidden="0" w:uiPriority="66" w:unhideWhenUsed="0"/>
-    <w:lsdException w:name="Medium Grid 1" w:semiHidden="0" w:uiPriority="67" w:unhideWhenUsed="0"/>
-    <w:lsdException w:name="Medium Grid 2" w:semiHidden="0" w:uiPriority="68" w:unhideWhenUsed="0"/>
-    <w:lsdException w:name="Medium Grid 3" w:semiHidden="0" w:uiPriority="69" w:unhideWhenUsed="0"/>
-    <w:lsdException w:name="Dark List" w:semiHidden="0" w:uiPriority="70" w:unhideWhenUsed="0"/>
-    <w:lsdException w:name="Colorful Shading" w:semiHidden="0" w:uiPriority="71" w:unhideWhenUsed="0"/>
-    <w:lsdException w:name="Colorful List" w:semiHidden="0" w:uiPriority="72" w:unhideWhenUsed="0"/>
-    <w:lsdException w:name="Colorful Grid" w:semiHidden="0" w:uiPriority="73" w:unhideWhenUsed="0"/>
-    <w:lsdException w:name="Light Shading Accent 1" w:semiHidden="0" w:uiPriority="60" w:unhideWhenUsed="0"/>
-    <w:lsdException w:name="Light List Accent 1" w:semiHidden="0" w:uiPriority="61" w:unhideWhenUsed="0"/>
-    <w:lsdException w:name="Light Grid Accent 1" w:semiHidden="0" w:uiPriority="62" w:unhideWhenUsed="0"/>
-    <w:lsdException w:name="Medium Shading 1 Accent 1" w:semiHidden="0" w:uiPriority="63" w:unhideWhenUsed="0"/>
-    <w:lsdException w:name="Medium Shading 2 Accent 1" w:semiHidden="0" w:uiPriority="64" w:unhideWhenUsed="0"/>
-    <w:lsdException w:name="Medium List 1 Accent 1" w:semiHidden="0" w:uiPriority="65" w:unhideWhenUsed="0"/>
-    <w:lsdException w:name="Revision" w:unhideWhenUsed="0"/>
-    <w:lsdException w:name="List Paragraph" w:semiHidden="0" w:uiPriority="34" w:unhideWhenUsed="0" w:qFormat="1"/>
-    <w:lsdException w:name="Quote" w:semiHidden="0" w:uiPriority="29" w:unhideWhenUsed="0" w:qFormat="1"/>
-    <w:lsdException w:name="Intense Quote" w:semiHidden="0" w:uiPriority="30" w:unhideWhenUsed="0" w:qFormat="1"/>
-    <w:lsdException w:name="Medium List 2 Accent 1" w:semiHidden="0" w:uiPriority="66" w:unhideWhenUsed="0"/>
-    <w:lsdException w:name="Medium Grid 1 Accent 1" w:semiHidden="0" w:uiPriority="67" w:unhideWhenUsed="0"/>
-    <w:lsdException w:name="Medium Grid 2 Accent 1" w:semiHidden="0" w:uiPriority="68" w:unhideWhenUsed="0"/>
-    <w:lsdException w:name="Medium Grid 3 Accent 1" w:semiHidden="0" w:uiPriority="69" w:unhideWhenUsed="0"/>
-    <w:lsdException w:name="Dark List Accent 1" w:semiHidden="0" w:uiPriority="70" w:unhideWhenUsed="0"/>
-    <w:lsdException w:name="Colorful Shading Accent 1" w:semiHidden="0" w:uiPriority="71" w:unhideWhenUsed="0"/>
-    <w:lsdException w:name="Colorful List Accent 1" w:semiHidden="0" w:uiPriority="72" w:unhideWhenUsed="0"/>
-    <w:lsdException w:name="Colorful Grid Accent 1" w:semiHidden="0" w:uiPriority="73" w:unhideWhenUsed="0"/>
-    <w:lsdException w:name="Light Shading Accent 2" w:semiHidden="0" w:uiPriority="60" w:unhideWhenUsed="0"/>
-    <w:lsdException w:name="Light List Accent 2" w:semiHidden="0" w:uiPriority="61" w:unhideWhenUsed="0"/>
-    <w:lsdException w:name="Light Grid Accent 2" w:semiHidden="0" w:uiPriority="62" w:unhideWhenUsed="0"/>
-    <w:lsdException w:name="Medium Shading 1 Accent 2" w:semiHidden="0" w:uiPriority="63" w:unhideWhenUsed="0"/>
-    <w:lsdException w:name="Medium Shading 2 Accent 2" w:semiHidden="0" w:uiPriority="64" w:unhideWhenUsed="0"/>
-    <w:lsdException w:name="Medium List 1 Accent 2" w:semiHidden="0" w:uiPriority="65" w:unhideWhenUsed="0"/>
-    <w:lsdException w:name="Medium List 2 Accent 2" w:semiHidden="0" w:uiPriority="66" w:unhideWhenUsed="0"/>
-    <w:lsdException w:name="Medium Grid 1 Accent 2" w:semiHidden="0" w:uiPriority="67" w:unhideWhenUsed="0"/>
-    <w:lsdException w:name="Medium Grid 2 Accent 2" w:semiHidden="0" w:uiPriority="68" w:unhideWhenUsed="0"/>
-    <w:lsdException w:name="Medium Grid 3 Accent 2" w:semiHidden="0" w:uiPriority="69" w:unhideWhenUsed="0"/>
-    <w:lsdException w:name="Dark List Accent 2" w:semiHidden="0" w:uiPriority="70" w:unhideWhenUsed="0"/>
-    <w:lsdException w:name="Colorful Shading Accent 2" w:semiHidden="0" w:uiPriority="71" w:unhideWhenUsed="0"/>
-    <w:lsdException w:name="Colorful List Accent 2" w:semiHidden="0" w:uiPriority="72" w:unhideWhenUsed="0"/>
-    <w:lsdException w:name="Colorful Grid Accent 2" w:semiHidden="0" w:uiPriority="73" w:unhideWhenUsed="0"/>
-    <w:lsdException w:name="Light Shading Accent 3" w:semiHidden="0" w:uiPriority="60" w:unhideWhenUsed="0"/>
-    <w:lsdException w:name="Light List Accent 3" w:semiHidden="0" w:uiPriority="61" w:unhideWhenUsed="0"/>
-    <w:lsdException w:name="Light Grid Accent 3" w:semiHidden="0" w:uiPriority="62" w:unhideWhenUsed="0"/>
-    <w:lsdException w:name="Medium Shading 1 Accent 3" w:semiHidden="0" w:uiPriority="63" w:unhideWhenUsed="0"/>
-    <w:lsdException w:name="Medium Shading 2 Accent 3" w:semiHidden="0" w:uiPriority="64" w:unhideWhenUsed="0"/>
-    <w:lsdException w:name="Medium List 1 Accent 3" w:semiHidden="0" w:uiPriority="65" w:unhideWhenUsed="0"/>
-    <w:lsdException w:name="Medium List 2 Accent 3" w:semiHidden="0" w:uiPriority="66" w:unhideWhenUsed="0"/>
-    <w:lsdException w:name="Medium Grid 1 Accent 3" w:semiHidden="0" w:uiPriority="67" w:unhideWhenUsed="0"/>
-    <w:lsdException w:name="Medium Grid 2 Accent 3" w:semiHidden="0" w:uiPriority="68" w:unhideWhenUsed="0"/>
-    <w:lsdException w:name="Medium Grid 3 Accent 3" w:semiHidden="0" w:uiPriority="69" w:unhideWhenUsed="0"/>
-    <w:lsdException w:name="Dark List Accent 3" w:semiHidden="0" w:uiPriority="70" w:unhideWhenUsed="0"/>
-    <w:lsdException w:name="Colorful Shading Accent 3" w:semiHidden="0" w:uiPriority="71" w:unhideWhenUsed="0"/>
-    <w:lsdException w:name="Colorful List Accent 3" w:semiHidden="0" w:uiPriority="72" w:unhideWhenUsed="0"/>
-    <w:lsdException w:name="Colorful Grid Accent 3" w:semiHidden="0" w:uiPriority="73" w:unhideWhenUsed="0"/>
-    <w:lsdException w:name="Light Shading Accent 4" w:semiHidden="0" w:uiPriority="60" w:unhideWhenUsed="0"/>
-    <w:lsdException w:name="Light List Accent 4" w:semiHidden="0" w:uiPriority="61" w:unhideWhenUsed="0"/>
-    <w:lsdException w:name="Light Grid Accent 4" w:semiHidden="0" w:uiPriority="62" w:unhideWhenUsed="0"/>
-    <w:lsdException w:name="Medium Shading 1 Accent 4" w:semiHidden="0" w:uiPriority="63" w:unhideWhenUsed="0"/>
-    <w:lsdException w:name="Medium Shading 2 Accent 4" w:semiHidden="0" w:uiPriority="64" w:unhideWhenUsed="0"/>
-    <w:lsdException w:name="Medium List 1 Accent 4" w:semiHidden="0" w:uiPriority="65" w:unhideWhenUsed="0"/>
-    <w:lsdException w:name="Medium List 2 Accent 4" w:semiHidden="0" w:uiPriority="66" w:unhideWhenUsed="0"/>
-    <w:lsdException w:name="Medium Grid 1 Accent 4" w:semiHidden="0" w:uiPriority="67" w:unhideWhenUsed="0"/>
-    <w:lsdException w:name="Medium Grid 2 Accent 4" w:semiHidden="0" w:uiPriority="68" w:unhideWhenUsed="0"/>
-    <w:lsdException w:name="Medium Grid 3 Accent 4" w:semiHidden="0" w:uiPriority="69" w:unhideWhenUsed="0"/>
-    <w:lsdException w:name="Dark List Accent 4" w:semiHidden="0" w:uiPriority="70" w:unhideWhenUsed="0"/>
-    <w:lsdException w:name="Colorful Shading Accent 4" w:semiHidden="0" w:uiPriority="71" w:unhideWhenUsed="0"/>
-    <w:lsdException w:name="Colorful List Accent 4" w:semiHidden="0" w:uiPriority="72" w:unhideWhenUsed="0"/>
-    <w:lsdException w:name="Colorful Grid Accent 4" w:semiHidden="0" w:uiPriority="73" w:unhideWhenUsed="0"/>
-    <w:lsdException w:name="Light Shading Accent 5" w:semiHidden="0" w:uiPriority="60" w:unhideWhenUsed="0"/>
-    <w:lsdException w:name="Light List Accent 5" w:semiHidden="0" w:uiPriority="61" w:unhideWhenUsed="0"/>
-    <w:lsdException w:name="Light Grid Accent 5" w:semiHidden="0" w:uiPriority="62" w:unhideWhenUsed="0"/>
-    <w:lsdException w:name="Medium Shading 1 Accent 5" w:semiHidden="0" w:uiPriority="63" w:unhideWhenUsed="0"/>
-    <w:lsdException w:name="Medium Shading 2 Accent 5" w:semiHidden="0" w:uiPriority="64" w:unhideWhenUsed="0"/>
-    <w:lsdException w:name="Medium List 1 Accent 5" w:semiHidden="0" w:uiPriority="65" w:unhideWhenUsed="0"/>
-    <w:lsdException w:name="Medium List 2 Accent 5" w:semiHidden="0" w:uiPriority="66" w:unhideWhenUsed="0"/>
-    <w:lsdException w:name="Medium Grid 1 Accent 5" w:semiHidden="0" w:uiPriority="67" w:unhideWhenUsed="0"/>
-    <w:lsdException w:name="Medium Grid 2 Accent 5" w:semiHidden="0" w:uiPriority="68" w:unhideWhenUsed="0"/>
-    <w:lsdException w:name="Medium Grid 3 Accent 5" w:semiHidden="0" w:uiPriority="69" w:unhideWhenUsed="0"/>
-    <w:lsdException w:name="Dark List Accent 5" w:semiHidden="0" w:uiPriority="70" w:unhideWhenUsed="0"/>
-    <w:lsdException w:name="Colorful Shading Accent 5" w:semiHidden="0" w:uiPriority="71" w:unhideWhenUsed="0"/>
-    <w:lsdException w:name="Colorful List Accent 5" w:semiHidden="0" w:uiPriority="72" w:unhideWhenUsed="0"/>
-    <w:lsdException w:name="Colorful Grid Accent 5" w:semiHidden="0" w:uiPriority="73" w:unhideWhenUsed="0"/>
-    <w:lsdException w:name="Light Shading Accent 6" w:semiHidden="0" w:uiPriority="60" w:unhideWhenUsed="0"/>
-    <w:lsdException w:name="Light List Accent 6" w:semiHidden="0" w:uiPriority="61" w:unhideWhenUsed="0"/>
-    <w:lsdException w:name="Light Grid Accent 6" w:semiHidden="0" w:uiPriority="62" w:unhideWhenUsed="0"/>
-    <w:lsdException w:name="Medium Shading 1 Accent 6" w:semiHidden="0" w:uiPriority="63" w:unhideWhenUsed="0"/>
-    <w:lsdException w:name="Medium Shading 2 Accent 6" w:semiHidden="0" w:uiPriority="64" w:unhideWhenUsed="0"/>
-    <w:lsdException w:name="Medium List 1 Accent 6" w:semiHidden="0" w:uiPriority="65" w:unhideWhenUsed="0"/>
-    <w:lsdException w:name="Medium List 2 Accent 6" w:semiHidden="0" w:uiPriority="66" w:unhideWhenUsed="0"/>
-    <w:lsdException w:name="Medium Grid 1 Accent 6" w:semiHidden="0" w:uiPriority="67" w:unhideWhenUsed="0"/>
-    <w:lsdException w:name="Medium Grid 2 Accent 6" w:semiHidden="0" w:uiPriority="68" w:unhideWhenUsed="0"/>
-    <w:lsdException w:name="Medium Grid 3 Accent 6" w:semiHidden="0" w:uiPriority="69" w:unhideWhenUsed="0"/>
-    <w:lsdException w:name="Dark List Accent 6" w:semiHidden="0" w:uiPriority="70" w:unhideWhenUsed="0"/>
-    <w:lsdException w:name="Colorful Shading Accent 6" w:semiHidden="0" w:uiPriority="71" w:unhideWhenUsed="0"/>
-    <w:lsdException w:name="Colorful List Accent 6" w:semiHidden="0" w:uiPriority="72" w:unhideWhenUsed="0"/>
-    <w:lsdException w:name="Colorful Grid Accent 6" w:semiHidden="0" w:uiPriority="73" w:unhideWhenUsed="0"/>
-    <w:lsdException w:name="Subtle Emphasis" w:semiHidden="0" w:uiPriority="19" w:unhideWhenUsed="0" w:qFormat="1"/>
-    <w:lsdException w:name="Intense Emphasis" w:semiHidden="0" w:uiPriority="21" w:unhideWhenUsed="0" w:qFormat="1"/>
-    <w:lsdException w:name="Subtle Reference" w:semiHidden="0" w:uiPriority="31" w:unhideWhenUsed="0" w:qFormat="1"/>
-    <w:lsdException w:name="Intense Reference" w:semiHidden="0" w:uiPriority="32" w:unhideWhenUsed="0" w:qFormat="1"/>
-    <w:lsdException w:name="Book Title" w:semiHidden="0" w:uiPriority="33" w:unhideWhenUsed="0" w:qFormat="1"/>
-    <w:lsdException w:name="Bibliography" w:uiPriority="37"/>
-    <w:lsdException w:name="TOC Heading" w:uiPriority="39" w:qFormat="1"/>
-  </w:latentStyles>
-  <w:style w:type="paragraph" w:default="1" w:styleId="Normal">
-    <w:name w:val="Normal"/>
-    <w:qFormat/>
-  </w:style>
-  <w:style w:type="character" w:default="1" w:styleId="DefaultParagraphFont">
-    <w:name w:val="Default Paragraph Font"/>
-    <w:uiPriority w:val="1"/>
-    <w:semiHidden/>
-    <w:unhideWhenUsed/>
-  </w:style>
-  <w:style w:type="table" w:default="1" w:styleId="TableNormal">
-    <w:name w:val="Normal Table"/>
-    <w:uiPriority w:val="99"/>
-    <w:semiHidden/>
-    <w:unhideWhenUsed/>
-    <w:tblPr>
-      <w:tblInd w:w="0" w:type="dxa"/>
-      <w:tblCellMar>
-        <w:top w:w="0" w:type="dxa"/>
-        <w:left w:w="108" w:type="dxa"/>
-        <w:bottom w:w="0" w:type="dxa"/>
-        <w:right w:w="108" w:type="dxa"/>
-      </w:tblCellMar>
-    </w:tblPr>
-  </w:style>
-  <w:style w:type="numbering" w:default="1" w:styleId="NoList">
-    <w:name w:val="No List"/>
-    <w:uiPriority w:val="99"/>
-    <w:semiHidden/>
-    <w:unhideWhenUsed/>
-  </w:style>
-  <w:style w:type="table" w:styleId="TableGrid">
-    <w:name w:val="Table Grid"/>
-    <w:basedOn w:val="TableNormal"/>
-    <w:uiPriority w:val="39"/>
-    <w:rsid w:val="00E11788"/>
-    <w:tblPr>
-      <w:tblBorders>
-        <w:top w:val="single" w:sz="4" w:space="0" w:color="auto"/>
-        <w:left w:val="single" w:sz="4" w:space="0" w:color="auto"/>
-        <w:bottom w:val="single" w:sz="4" w:space="0" w:color="auto"/>
-        <w:right w:val="single" w:sz="4" w:space="0" w:color="auto"/>
-        <w:insideH w:val="single" w:sz="4" w:space="0" w:color="auto"/>
-        <w:insideV w:val="single" w:sz="4" w:space="0" w:color="auto"/>
-      </w:tblBorders>
-    </w:tblPr>
-  </w:style>
-  <w:style w:type="paragraph" w:styleId="Header">
-    <w:name w:val="header"/>
-    <w:basedOn w:val="Normal"/>
-    <w:link w:val="HeaderChar"/>
-    <w:uiPriority w:val="99"/>
-    <w:unhideWhenUsed/>
-    <w:rsid w:val="005E1A34"/>
-    <w:pPr>
-      <w:tabs>
-        <w:tab w:val="center" w:pos="4680"/>
-        <w:tab w:val="right" w:pos="9360"/>
-      </w:tabs>
-    </w:pPr>
-  </w:style>
-  <w:style w:type="character" w:customStyle="1" w:styleId="HeaderChar">
-    <w:name w:val="Header Char"/>
-    <w:basedOn w:val="DefaultParagraphFont"/>
-    <w:link w:val="Header"/>
-    <w:uiPriority w:val="99"/>
-    <w:rsid w:val="005E1A34"/>
-  </w:style>
-  <w:style w:type="paragraph" w:styleId="Footer">
-    <w:name w:val="footer"/>
-    <w:basedOn w:val="Normal"/>
-    <w:link w:val="FooterChar"/>
-    <w:uiPriority w:val="99"/>
-    <w:unhideWhenUsed/>
-    <w:rsid w:val="005E1A34"/>
-    <w:pPr>
-      <w:tabs>
-        <w:tab w:val="center" w:pos="4680"/>
-        <w:tab w:val="right" w:pos="9360"/>
-      </w:tabs>
-    </w:pPr>
-  </w:style>
-  <w:style w:type="character" w:customStyle="1" w:styleId="FooterChar">
-    <w:name w:val="Footer Char"/>
-    <w:basedOn w:val="DefaultParagraphFont"/>
-    <w:link w:val="Footer"/>
-    <w:uiPriority w:val="99"/>
-    <w:rsid w:val="005E1A34"/>
-  </w:style>
-  <w:style w:type="character" w:styleId="CommentReference">
-    <w:name w:val="annotation reference"/>
-    <w:basedOn w:val="DefaultParagraphFont"/>
-    <w:uiPriority w:val="99"/>
-    <w:semiHidden/>
-    <w:unhideWhenUsed/>
-    <w:rsid w:val="0025478F"/>
-    <w:rPr>
-      <w:sz w:val="16"/>
-      <w:szCs w:val="16"/>
-    </w:rPr>
-  </w:style>
-  <w:style w:type="paragraph" w:styleId="CommentText">
-    <w:name w:val="annotation text"/>
-    <w:basedOn w:val="Normal"/>
-    <w:link w:val="CommentTextChar"/>
-    <w:uiPriority w:val="99"/>
-    <w:semiHidden/>
-    <w:unhideWhenUsed/>
-    <w:rsid w:val="0025478F"/>
-    <w:rPr>
-      <w:sz w:val="20"/>
-      <w:szCs w:val="20"/>
-    </w:rPr>
-  </w:style>
-  <w:style w:type="character" w:customStyle="1" w:styleId="CommentTextChar">
-    <w:name w:val="Comment Text Char"/>
-    <w:basedOn w:val="DefaultParagraphFont"/>
-    <w:link w:val="CommentText"/>
-    <w:uiPriority w:val="99"/>
-    <w:semiHidden/>
-    <w:rsid w:val="0025478F"/>
-    <w:rPr>
-      <w:sz w:val="20"/>
-      <w:szCs w:val="20"/>
-    </w:rPr>
-  </w:style>
-  <w:style w:type="paragraph" w:styleId="CommentSubject">
-    <w:name w:val="annotation subject"/>
-    <w:basedOn w:val="CommentText"/>
-    <w:next w:val="CommentText"/>
-    <w:link w:val="CommentSubjectChar"/>
-    <w:uiPriority w:val="99"/>
-    <w:semiHidden/>
-    <w:unhideWhenUsed/>
-    <w:rsid w:val="0025478F"/>
-    <w:rPr>
-      <w:b/>
-      <w:bCs/>
-    </w:rPr>
-  </w:style>
-  <w:style w:type="character" w:customStyle="1" w:styleId="CommentSubjectChar">
-    <w:name w:val="Comment Subject Char"/>
-    <w:basedOn w:val="CommentTextChar"/>
-    <w:link w:val="CommentSubject"/>
-    <w:uiPriority w:val="99"/>
-    <w:semiHidden/>
-    <w:rsid w:val="0025478F"/>
-    <w:rPr>
-      <w:b/>
-      <w:bCs/>
-      <w:sz w:val="20"/>
-      <w:szCs w:val="20"/>
-    </w:rPr>
-  </w:style>
-  <w:style w:type="paragraph" w:styleId="BalloonText">
-    <w:name w:val="Balloon Text"/>
-    <w:basedOn w:val="Normal"/>
-    <w:link w:val="BalloonTextChar"/>
-    <w:uiPriority w:val="99"/>
-    <w:semiHidden/>
-    <w:unhideWhenUsed/>
-    <w:rsid w:val="0025478F"/>
-    <w:rPr>
-      <w:rFonts w:ascii="Segoe UI" w:hAnsi="Segoe UI" w:cs="Segoe UI"/>
-      <w:sz w:val="18"/>
-      <w:szCs w:val="18"/>
-    </w:rPr>
-  </w:style>
-  <w:style w:type="character" w:customStyle="1" w:styleId="BalloonTextChar">
-    <w:name w:val="Balloon Text Char"/>
-    <w:basedOn w:val="DefaultParagraphFont"/>
-    <w:link w:val="BalloonText"/>
-    <w:uiPriority w:val="99"/>
-    <w:semiHidden/>
-    <w:rsid w:val="0025478F"/>
-    <w:rPr>
-      <w:rFonts w:ascii="Segoe UI" w:hAnsi="Segoe UI" w:cs="Segoe UI"/>
-      <w:sz w:val="18"/>
-      <w:szCs w:val="18"/>
-    </w:rPr>
-  </w:style>
-  <w:style w:type="paragraph" w:styleId="ListParagraph">
-    <w:name w:val="List Paragraph"/>
-    <w:basedOn w:val="Normal"/>
-    <w:uiPriority w:val="34"/>
-    <w:qFormat/>
-    <w:rsid w:val="00024A4C"/>
-    <w:pPr>
-      <w:ind w:left="720"/>
-      <w:contextualSpacing/>
-    </w:pPr>
-  </w:style>
-  <w:style w:type="character" w:customStyle="1" w:styleId="lrzxr">
-    <w:name w:val="lrzxr"/>
-    <w:basedOn w:val="DefaultParagraphFont"/>
-    <w:rsid w:val="00F509DB"/>
-  </w:style>
-</w:styles>
-</file>
-
-<file path=word/stylesWithEffects.xml><?xml version="1.0" encoding="utf-8"?>
-<w:styles xmlns:wpc="http://schemas.microsoft.com/office/word/2010/wordprocessingCanvas" xmlns:mc="http://schemas.openxmlformats.org/markup-compatibility/2006" xmlns:o="urn:schemas-microsoft-com:office:office" xmlns:r="http://schemas.openxmlformats.org/officeDocument/2006/relationships" xmlns:m="http://schemas.openxmlformats.org/officeDocument/2006/math" xmlns:v="urn:schemas-microsoft-com:vml" xmlns:wp14="http://schemas.microsoft.com/office/word/2010/wordprocessingDrawing" xmlns:wp="http://schemas.openxmlformats.org/drawingml/2006/wordprocessingDrawing" xmlns:w10="urn:schemas-microsoft-com:office:word" xmlns:w="http://schemas.openxmlformats.org/wordprocessingml/2006/main" xmlns:w14="http://schemas.microsoft.com/office/word/2010/wordml" xmlns:wpg="http://schemas.microsoft.com/office/word/2010/wordprocessingGroup" xmlns:wpi="http://schemas.microsoft.com/office/word/2010/wordprocessingInk" xmlns:wne="http://schemas.microsoft.com/office/word/2006/wordml" xmlns:wps="http://schemas.microsoft.com/office/word/2010/wordprocessingShape" mc:Ignorable="w14 wp14">
-  <w:docDefaults>
-    <w:rPrDefault>
-      <w:rPr>
-        <w:rFonts w:asciiTheme="minorHAnsi" w:eastAsiaTheme="minorHAnsi" w:hAnsiTheme="minorHAnsi" w:cstheme="minorBidi"/>
-        <w:sz w:val="22"/>
-        <w:szCs w:val="22"/>
-        <w:lang w:val="en-US" w:eastAsia="en-US" w:bidi="ar-SA"/>
-      </w:rPr>
-    </w:rPrDefault>
-    <w:pPrDefault/>
-  </w:docDefaults>
-  <w:latentStyles w:defLockedState="0" w:defUIPriority="99" w:defSemiHidden="1" w:defUnhideWhenUsed="1" w:defQFormat="0" w:count="267">
-    <w:lsdException w:name="Normal" w:semiHidden="0" w:uiPriority="0" w:unhideWhenUsed="0" w:qFormat="1"/>
-    <w:lsdException w:name="heading 1" w:semiHidden="0" w:uiPriority="9" w:unhideWhenUsed="0" w:qFormat="1"/>
-    <w:lsdException w:name="heading 2" w:uiPriority="9" w:qFormat="1"/>
-    <w:lsdException w:name="heading 3" w:uiPriority="9" w:qFormat="1"/>
-    <w:lsdException w:name="heading 4" w:uiPriority="9" w:qFormat="1"/>
-    <w:lsdException w:name="heading 5" w:uiPriority="9" w:qFormat="1"/>
-    <w:lsdException w:name="heading 6" w:uiPriority="9" w:qFormat="1"/>
-    <w:lsdException w:name="heading 7" w:uiPriority="9" w:qFormat="1"/>
-    <w:lsdException w:name="heading 8" w:uiPriority="9" w:qFormat="1"/>
-    <w:lsdException w:name="heading 9" w:uiPriority="9" w:qFormat="1"/>
-    <w:lsdException w:name="toc 1" w:uiPriority="39"/>
-    <w:lsdException w:name="toc 2" w:uiPriority="39"/>
-    <w:lsdException w:name="toc 3" w:uiPriority="39"/>
-    <w:lsdException w:name="toc 4" w:uiPriority="39"/>
-    <w:lsdException w:name="toc 5" w:uiPriority="39"/>
-    <w:lsdException w:name="toc 6" w:uiPriority="39"/>
-    <w:lsdException w:name="toc 7" w:uiPriority="39"/>
-    <w:lsdException w:name="toc 8" w:uiPriority="39"/>
-    <w:lsdException w:name="toc 9" w:uiPriority="39"/>
-    <w:lsdException w:name="caption" w:uiPriority="35" w:qFormat="1"/>
-    <w:lsdException w:name="Title" w:semiHidden="0" w:uiPriority="10" w:unhideWhenUsed="0" w:qFormat="1"/>
-    <w:lsdException w:name="Default Paragraph Font" w:uiPriority="1"/>
-    <w:lsdException w:name="Subtitle" w:semiHidden="0" w:uiPriority="11" w:unhideWhenUsed="0" w:qFormat="1"/>
-    <w:lsdException w:name="Strong" w:semiHidden="0" w:uiPriority="22" w:unhideWhenUsed="0" w:qFormat="1"/>
-    <w:lsdException w:name="Emphasis" w:semiHidden="0" w:uiPriority="20" w:unhideWhenUsed="0" w:qFormat="1"/>
-    <w:lsdException w:name="Table Grid" w:semiHidden="0" w:uiPriority="39" w:unhideWhenUsed="0"/>
-    <w:lsdException w:name="Placeholder Text" w:unhideWhenUsed="0"/>
-    <w:lsdException w:name="No Spacing" w:semiHidden="0" w:uiPriority="1" w:unhideWhenUsed="0" w:qFormat="1"/>
-    <w:lsdException w:name="Light Shading" w:semiHidden="0" w:uiPriority="60" w:unhideWhenUsed="0"/>
-    <w:lsdException w:name="Light List" w:semiHidden="0" w:uiPriority="61" w:unhideWhenUsed="0"/>
-    <w:lsdException w:name="Light Grid" w:semiHidden="0" w:uiPriority="62" w:unhideWhenUsed="0"/>
-    <w:lsdException w:name="Medium Shading 1" w:semiHidden="0" w:uiPriority="63" w:unhideWhenUsed="0"/>
-    <w:lsdException w:name="Medium Shading 2" w:semiHidden="0" w:uiPriority="64" w:unhideWhenUsed="0"/>
-    <w:lsdException w:name="Medium List 1" w:semiHidden="0" w:uiPriority="65" w:unhideWhenUsed="0"/>
-    <w:lsdException w:name="Medium List 2" w:semiHidden="0" w:uiPriority="66" w:unhideWhenUsed="0"/>
-    <w:lsdException w:name="Medium Grid 1" w:semiHidden="0" w:uiPriority="67" w:unhideWhenUsed="0"/>
-    <w:lsdException w:name="Medium Grid 2" w:semiHidden="0" w:uiPriority="68" w:unhideWhenUsed="0"/>
-    <w:lsdException w:name="Medium Grid 3" w:semiHidden="0" w:uiPriority="69" w:unhideWhenUsed="0"/>
-    <w:lsdException w:name="Dark List" w:semiHidden="0" w:uiPriority="70" w:unhideWhenUsed="0"/>
-    <w:lsdException w:name="Colorful Shading" w:semiHidden="0" w:uiPriority="71" w:unhideWhenUsed="0"/>
-    <w:lsdException w:name="Colorful List" w:semiHidden="0" w:uiPriority="72" w:unhideWhenUsed="0"/>
-    <w:lsdException w:name="Colorful Grid" w:semiHidden="0" w:uiPriority="73" w:unhideWhenUsed="0"/>
-    <w:lsdException w:name="Light Shading Accent 1" w:semiHidden="0" w:uiPriority="60" w:unhideWhenUsed="0"/>
-    <w:lsdException w:name="Light List Accent 1" w:semiHidden="0" w:uiPriority="61" w:unhideWhenUsed="0"/>
-    <w:lsdException w:name="Light Grid Accent 1" w:semiHidden="0" w:uiPriority="62" w:unhideWhenUsed="0"/>
-    <w:lsdException w:name="Medium Shading 1 Accent 1" w:semiHidden="0" w:uiPriority="63" w:unhideWhenUsed="0"/>
-    <w:lsdException w:name="Medium Shading 2 Accent 1" w:semiHidden="0" w:uiPriority="64" w:unhideWhenUsed="0"/>
-    <w:lsdException w:name="Medium List 1 Accent 1" w:semiHidden="0" w:uiPriority="65" w:unhideWhenUsed="0"/>
-    <w:lsdException w:name="Revision" w:unhideWhenUsed="0"/>
-    <w:lsdException w:name="List Paragraph" w:semiHidden="0" w:uiPriority="34" w:unhideWhenUsed="0" w:qFormat="1"/>
-    <w:lsdException w:name="Quote" w:semiHidden="0" w:uiPriority="29" w:unhideWhenUsed="0" w:qFormat="1"/>
-    <w:lsdException w:name="Intense Quote" w:semiHidden="0" w:uiPriority="30" w:unhideWhenUsed="0" w:qFormat="1"/>
-    <w:lsdException w:name="Medium List 2 Accent 1" w:semiHidden="0" w:uiPriority="66" w:unhideWhenUsed="0"/>
-    <w:lsdException w:name="Medium Grid 1 Accent 1" w:semiHidden="0" w:uiPriority="67" w:unhideWhenUsed="0"/>
-    <w:lsdException w:name="Medium Grid 2 Accent 1" w:semiHidden="0" w:uiPriority="68" w:unhideWhenUsed="0"/>
-    <w:lsdException w:name="Medium Grid 3 Accent 1" w:semiHidden="0" w:uiPriority="69" w:unhideWhenUsed="0"/>
-    <w:lsdException w:name="Dark List Accent 1" w:semiHidden="0" w:uiPriority="70" w:unhideWhenUsed="0"/>
-    <w:lsdException w:name="Colorful Shading Accent 1" w:semiHidden="0" w:uiPriority="71" w:unhideWhenUsed="0"/>
-    <w:lsdException w:name="Colorful List Accent 1" w:semiHidden="0" w:uiPriority="72" w:unhideWhenUsed="0"/>
-    <w:lsdException w:name="Colorful Grid Accent 1" w:semiHidden="0" w:uiPriority="73" w:unhideWhenUsed="0"/>
-    <w:lsdException w:name="Light Shading Accent 2" w:semiHidden="0" w:uiPriority="60" w:unhideWhenUsed="0"/>
-    <w:lsdException w:name="Light List Accent 2" w:semiHidden="0" w:uiPriority="61" w:unhideWhenUsed="0"/>
-    <w:lsdException w:name="Light Grid Accent 2" w:semiHidden="0" w:uiPriority="62" w:unhideWhenUsed="0"/>
-    <w:lsdException w:name="Medium Shading 1 Accent 2" w:semiHidden="0" w:uiPriority="63" w:unhideWhenUsed="0"/>
-    <w:lsdException w:name="Medium Shading 2 Accent 2" w:semiHidden="0" w:uiPriority="64" w:unhideWhenUsed="0"/>
-    <w:lsdException w:name="Medium List 1 Accent 2" w:semiHidden="0" w:uiPriority="65" w:unhideWhenUsed="0"/>
-    <w:lsdException w:name="Medium List 2 Accent 2" w:semiHidden="0" w:uiPriority="66" w:unhideWhenUsed="0"/>
-    <w:lsdException w:name="Medium Grid 1 Accent 2" w:semiHidden="0" w:uiPriority="67" w:unhideWhenUsed="0"/>
-    <w:lsdException w:name="Medium Grid 2 Accent 2" w:semiHidden="0" w:uiPriority="68" w:unhideWhenUsed="0"/>
-    <w:lsdException w:name="Medium Grid 3 Accent 2" w:semiHidden="0" w:uiPriority="69" w:unhideWhenUsed="0"/>
-    <w:lsdException w:name="Dark List Accent 2" w:semiHidden="0" w:uiPriority="70" w:unhideWhenUsed="0"/>
-    <w:lsdException w:name="Colorful Shading Accent 2" w:semiHidden="0" w:uiPriority="71" w:unhideWhenUsed="0"/>
-    <w:lsdException w:name="Colorful List Accent 2" w:semiHidden="0" w:uiPriority="72" w:unhideWhenUsed="0"/>
-    <w:lsdException w:name="Colorful Grid Accent 2" w:semiHidden="0" w:uiPriority="73" w:unhideWhenUsed="0"/>
-    <w:lsdException w:name="Light Shading Accent 3" w:semiHidden="0" w:uiPriority="60" w:unhideWhenUsed="0"/>
-    <w:lsdException w:name="Light List Accent 3" w:semiHidden="0" w:uiPriority="61" w:unhideWhenUsed="0"/>
-    <w:lsdException w:name="Light Grid Accent 3" w:semiHidden="0" w:uiPriority="62" w:unhideWhenUsed="0"/>
-    <w:lsdException w:name="Medium Shading 1 Accent 3" w:semiHidden="0" w:uiPriority="63" w:unhideWhenUsed="0"/>
-    <w:lsdException w:name="Medium Shading 2 Accent 3" w:semiHidden="0" w:uiPriority="64" w:unhideWhenUsed="0"/>
-    <w:lsdException w:name="Medium List 1 Accent 3" w:semiHidden="0" w:uiPriority="65" w:unhideWhenUsed="0"/>
-    <w:lsdException w:name="Medium List 2 Accent 3" w:semiHidden="0" w:uiPriority="66" w:unhideWhenUsed="0"/>
-    <w:lsdException w:name="Medium Grid 1 Accent 3" w:semiHidden="0" w:uiPriority="67" w:unhideWhenUsed="0"/>
-    <w:lsdException w:name="Medium Grid 2 Accent 3" w:semiHidden="0" w:uiPriority="68" w:unhideWhenUsed="0"/>
-    <w:lsdException w:name="Medium Grid 3 Accent 3" w:semiHidden="0" w:uiPriority="69" w:unhideWhenUsed="0"/>
-    <w:lsdException w:name="Dark List Accent 3" w:semiHidden="0" w:uiPriority="70" w:unhideWhenUsed="0"/>
-    <w:lsdException w:name="Colorful Shading Accent 3" w:semiHidden="0" w:uiPriority="71" w:unhideWhenUsed="0"/>
-    <w:lsdException w:name="Colorful List Accent 3" w:semiHidden="0" w:uiPriority="72" w:unhideWhenUsed="0"/>
-    <w:lsdException w:name="Colorful Grid Accent 3" w:semiHidden="0" w:uiPriority="73" w:unhideWhenUsed="0"/>
-    <w:lsdException w:name="Light Shading Accent 4" w:semiHidden="0" w:uiPriority="60" w:unhideWhenUsed="0"/>
-    <w:lsdException w:name="Light List Accent 4" w:semiHidden="0" w:uiPriority="61" w:unhideWhenUsed="0"/>
-    <w:lsdException w:name="Light Grid Accent 4" w:semiHidden="0" w:uiPriority="62" w:unhideWhenUsed="0"/>
-    <w:lsdException w:name="Medium Shading 1 Accent 4" w:semiHidden="0" w:uiPriority="63" w:unhideWhenUsed="0"/>
-    <w:lsdException w:name="Medium Shading 2 Accent 4" w:semiHidden="0" w:uiPriority="64" w:unhideWhenUsed="0"/>
-    <w:lsdException w:name="Medium List 1 Accent 4" w:semiHidden="0" w:uiPriority="65" w:unhideWhenUsed="0"/>
-    <w:lsdException w:name="Medium List 2 Accent 4" w:semiHidden="0" w:uiPriority="66" w:unhideWhenUsed="0"/>
-    <w:lsdException w:name="Medium Grid 1 Accent 4" w:semiHidden="0" w:uiPriority="67" w:unhideWhenUsed="0"/>
-    <w:lsdException w:name="Medium Grid 2 Accent 4" w:semiHidden="0" w:uiPriority="68" w:unhideWhenUsed="0"/>
-    <w:lsdException w:name="Medium Grid 3 Accent 4" w:semiHidden="0" w:uiPriority="69" w:unhideWhenUsed="0"/>
-    <w:lsdException w:name="Dark List Accent 4" w:semiHidden="0" w:uiPriority="70" w:unhideWhenUsed="0"/>
-    <w:lsdException w:name="Colorful Shading Accent 4" w:semiHidden="0" w:uiPriority="71" w:unhideWhenUsed="0"/>
-    <w:lsdException w:name="Colorful List Accent 4" w:semiHidden="0" w:uiPriority="72" w:unhideWhenUsed="0"/>
-    <w:lsdException w:name="Colorful Grid Accent 4" w:semiHidden="0" w:uiPriority="73" w:unhideWhenUsed="0"/>
-    <w:lsdException w:name="Light Shading Accent 5" w:semiHidden="0" w:uiPriority="60" w:unhideWhenUsed="0"/>
-    <w:lsdException w:name="Light List Accent 5" w:semiHidden="0" w:uiPriority="61" w:unhideWhenUsed="0"/>
-    <w:lsdException w:name="Light Grid Accent 5" w:semiHidden="0" w:uiPriority="62" w:unhideWhenUsed="0"/>
-    <w:lsdException w:name="Medium Shading 1 Accent 5" w:semiHidden="0" w:uiPriority="63" w:unhideWhenUsed="0"/>
-    <w:lsdException w:name="Medium Shading 2 Accent 5" w:semiHidden="0" w:uiPriority="64" w:unhideWhenUsed="0"/>
-    <w:lsdException w:name="Medium List 1 Accent 5" w:semiHidden="0" w:uiPriority="65" w:unhideWhenUsed="0"/>
-    <w:lsdException w:name="Medium List 2 Accent 5" w:semiHidden="0" w:uiPriority="66" w:unhideWhenUsed="0"/>
-    <w:lsdException w:name="Medium Grid 1 Accent 5" w:semiHidden="0" w:uiPriority="67" w:unhideWhenUsed="0"/>
-    <w:lsdException w:name="Medium Grid 2 Accent 5" w:semiHidden="0" w:uiPriority="68" w:unhideWhenUsed="0"/>
-    <w:lsdException w:name="Medium Grid 3 Accent 5" w:semiHidden="0" w:uiPriority="69" w:unhideWhenUsed="0"/>
-    <w:lsdException w:name="Dark List Accent 5" w:semiHidden="0" w:uiPriority="70" w:unhideWhenUsed="0"/>
-    <w:lsdException w:name="Colorful Shading Accent 5" w:semiHidden="0" w:uiPriority="71" w:unhideWhenUsed="0"/>
-    <w:lsdException w:name="Colorful List Accent 5" w:semiHidden="0" w:uiPriority="72" w:unhideWhenUsed="0"/>
-    <w:lsdException w:name="Colorful Grid Accent 5" w:semiHidden="0" w:uiPriority="73" w:unhideWhenUsed="0"/>
-    <w:lsdException w:name="Light Shading Accent 6" w:semiHidden="0" w:uiPriority="60" w:unhideWhenUsed="0"/>
-    <w:lsdException w:name="Light List Accent 6" w:semiHidden="0" w:uiPriority="61" w:unhideWhenUsed="0"/>
-    <w:lsdException w:name="Light Grid Accent 6" w:semiHidden="0" w:uiPriority="62" w:unhideWhenUsed="0"/>
-    <w:lsdException w:name="Medium Shading 1 Accent 6" w:semiHidden="0" w:uiPriority="63" w:unhideWhenUsed="0"/>
-    <w:lsdException w:name="Medium Shading 2 Accent 6" w:semiHidden="0" w:uiPriority="64" w:unhideWhenUsed="0"/>
-    <w:lsdException w:name="Medium List 1 Accent 6" w:semiHidden="0" w:uiPriority="65" w:unhideWhenUsed="0"/>
-    <w:lsdException w:name="Medium List 2 Accent 6" w:semiHidden="0" w:uiPriority="66" w:unhideWhenUsed="0"/>
-    <w:lsdException w:name="Medium Grid 1 Accent 6" w:semiHidden="0" w:uiPriority="67" w:unhideWhenUsed="0"/>
-    <w:lsdException w:name="Medium Grid 2 Accent 6" w:semiHidden="0" w:uiPriority="68" w:unhideWhenUsed="0"/>
-    <w:lsdException w:name="Medium Grid 3 Accent 6" w:semiHidden="0" w:uiPriority="69" w:unhideWhenUsed="0"/>
-    <w:lsdException w:name="Dark List Accent 6" w:semiHidden="0" w:uiPriority="70" w:unhideWhenUsed="0"/>
-    <w:lsdException w:name="Colorful Shading Accent 6" w:semiHidden="0" w:uiPriority="71" w:unhideWhenUsed="0"/>
-    <w:lsdException w:name="Colorful List Accent 6" w:semiHidden="0" w:uiPriority="72" w:unhideWhenUsed="0"/>
-    <w:lsdException w:name="Colorful Grid Accent 6" w:semiHidden="0" w:uiPriority="73" w:unhideWhenUsed="0"/>
-    <w:lsdException w:name="Subtle Emphasis" w:semiHidden="0" w:uiPriority="19" w:unhideWhenUsed="0" w:qFormat="1"/>
-    <w:lsdException w:name="Intense Emphasis" w:semiHidden="0" w:uiPriority="21" w:unhideWhenUsed="0" w:qFormat="1"/>
-    <w:lsdException w:name="Subtle Reference" w:semiHidden="0" w:uiPriority="31" w:unhideWhenUsed="0" w:qFormat="1"/>
-    <w:lsdException w:name="Intense Reference" w:semiHidden="0" w:uiPriority="32" w:unhideWhenUsed="0" w:qFormat="1"/>
-    <w:lsdException w:name="Book Title" w:semiHidden="0" w:uiPriority="33" w:unhideWhenUsed="0" w:qFormat="1"/>
-    <w:lsdException w:name="Bibliography" w:uiPriority="37"/>
-    <w:lsdException w:name="TOC Heading" w:uiPriority="39" w:qFormat="1"/>
+  <w:latentStyles w:defLockedState="0" w:defUIPriority="99" w:defSemiHidden="0" w:defUnhideWhenUsed="0" w:defQFormat="0" w:count="376">
+    <w:lsdException w:name="Normal" w:uiPriority="0" w:qFormat="1"/>
+    <w:lsdException w:name="heading 1" w:uiPriority="9" w:qFormat="1"/>
+    <w:lsdException w:name="heading 2" w:semiHidden="1" w:uiPriority="9" w:unhideWhenUsed="1" w:qFormat="1"/>
+    <w:lsdException w:name="heading 3" w:semiHidden="1" w:uiPriority="9" w:unhideWhenUsed="1" w:qFormat="1"/>
+    <w:lsdException w:name="heading 4" w:semiHidden="1" w:uiPriority="9" w:unhideWhenUsed="1" w:qFormat="1"/>
+    <w:lsdException w:name="heading 5" w:semiHidden="1" w:uiPriority="9" w:unhideWhenUsed="1" w:qFormat="1"/>
+    <w:lsdException w:name="heading 6" w:semiHidden="1" w:uiPriority="9" w:unhideWhenUsed="1" w:qFormat="1"/>
+    <w:lsdException w:name="heading 7" w:semiHidden="1" w:uiPriority="9" w:unhideWhenUsed="1" w:qFormat="1"/>
+    <w:lsdException w:name="heading 8" w:semiHidden="1" w:uiPriority="9" w:unhideWhenUsed="1" w:qFormat="1"/>
+    <w:lsdException w:name="heading 9" w:semiHidden="1" w:uiPriority="9" w:unhideWhenUsed="1" w:qFormat="1"/>
+    <w:lsdException w:name="index 1" w:semiHidden="1" w:unhideWhenUsed="1"/>
+    <w:lsdException w:name="index 2" w:semiHidden="1" w:unhideWhenUsed="1"/>
+    <w:lsdException w:name="index 3" w:semiHidden="1" w:unhideWhenUsed="1"/>
+    <w:lsdException w:name="index 4" w:semiHidden="1" w:unhideWhenUsed="1"/>
+    <w:lsdException w:name="index 5" w:semiHidden="1" w:unhideWhenUsed="1"/>
+    <w:lsdException w:name="index 6" w:semiHidden="1" w:unhideWhenUsed="1"/>
+    <w:lsdException w:name="index 7" w:semiHidden="1" w:unhideWhenUsed="1"/>
+    <w:lsdException w:name="index 8" w:semiHidden="1" w:unhideWhenUsed="1"/>
+    <w:lsdException w:name="index 9" w:semiHidden="1" w:unhideWhenUsed="1"/>
+    <w:lsdException w:name="toc 1" w:semiHidden="1" w:uiPriority="39" w:unhideWhenUsed="1"/>
+    <w:lsdException w:name="toc 2" w:semiHidden="1" w:uiPriority="39" w:unhideWhenUsed="1"/>
+    <w:lsdException w:name="toc 3" w:semiHidden="1" w:uiPriority="39" w:unhideWhenUsed="1"/>
+    <w:lsdException w:name="toc 4" w:semiHidden="1" w:uiPriority="39" w:unhideWhenUsed="1"/>
+    <w:lsdException w:name="toc 5" w:semiHidden="1" w:uiPriority="39" w:unhideWhenUsed="1"/>
+    <w:lsdException w:name="toc 6" w:semiHidden="1" w:uiPriority="39" w:unhideWhenUsed="1"/>
+    <w:lsdException w:name="toc 7" w:semiHidden="1" w:uiPriority="39" w:unhideWhenUsed="1"/>
+    <w:lsdException w:name="toc 8" w:semiHidden="1" w:uiPriority="39" w:unhideWhenUsed="1"/>
+    <w:lsdException w:name="toc 9" w:semiHidden="1" w:uiPriority="39" w:unhideWhenUsed="1"/>
+    <w:lsdException w:name="Normal Indent" w:semiHidden="1" w:unhideWhenUsed="1"/>
+    <w:lsdException w:name="footnote text" w:semiHidden="1" w:unhideWhenUsed="1"/>
+    <w:lsdException w:name="annotation text" w:semiHidden="1" w:unhideWhenUsed="1"/>
+    <w:lsdException w:name="header" w:semiHidden="1" w:unhideWhenUsed="1"/>
+    <w:lsdException w:name="footer" w:semiHidden="1" w:unhideWhenUsed="1"/>
+    <w:lsdException w:name="index heading" w:semiHidden="1" w:unhideWhenUsed="1"/>
+    <w:lsdException w:name="caption" w:semiHidden="1" w:uiPriority="35" w:unhideWhenUsed="1" w:qFormat="1"/>
+    <w:lsdException w:name="table of figures" w:semiHidden="1" w:unhideWhenUsed="1"/>
+    <w:lsdException w:name="envelope address" w:semiHidden="1" w:unhideWhenUsed="1"/>
+    <w:lsdException w:name="envelope return" w:semiHidden="1" w:unhideWhenUsed="1"/>
+    <w:lsdException w:name="footnote reference" w:semiHidden="1" w:unhideWhenUsed="1"/>
+    <w:lsdException w:name="annotation reference" w:semiHidden="1" w:unhideWhenUsed="1"/>
+    <w:lsdException w:name="line number" w:semiHidden="1" w:unhideWhenUsed="1"/>
+    <w:lsdException w:name="page number" w:semiHidden="1" w:unhideWhenUsed="1"/>
+    <w:lsdException w:name="endnote reference" w:semiHidden="1" w:unhideWhenUsed="1"/>
+    <w:lsdException w:name="endnote text" w:semiHidden="1" w:unhideWhenUsed="1"/>
+    <w:lsdException w:name="table of authorities" w:semiHidden="1" w:unhideWhenUsed="1"/>
+    <w:lsdException w:name="macro" w:semiHidden="1" w:unhideWhenUsed="1"/>
+    <w:lsdException w:name="toa heading" w:semiHidden="1" w:unhideWhenUsed="1"/>
+    <w:lsdException w:name="List" w:semiHidden="1" w:unhideWhenUsed="1"/>
+    <w:lsdException w:name="List Bullet" w:semiHidden="1" w:unhideWhenUsed="1"/>
+    <w:lsdException w:name="List Number" w:semiHidden="1" w:unhideWhenUsed="1"/>
+    <w:lsdException w:name="List 2" w:semiHidden="1" w:unhideWhenUsed="1"/>
+    <w:lsdException w:name="List 3" w:semiHidden="1" w:unhideWhenUsed="1"/>
+    <w:lsdException w:name="List 4" w:semiHidden="1" w:unhideWhenUsed="1"/>
+    <w:lsdException w:name="List 5" w:semiHidden="1" w:unhideWhenUsed="1"/>
+    <w:lsdException w:name="List Bullet 2" w:semiHidden="1" w:unhideWhenUsed="1"/>
+    <w:lsdException w:name="List Bullet 3" w:semiHidden="1" w:unhideWhenUsed="1"/>
+    <w:lsdException w:name="List Bullet 4" w:semiHidden="1" w:unhideWhenUsed="1"/>
+    <w:lsdException w:name="List Bullet 5" w:semiHidden="1" w:unhideWhenUsed="1"/>
+    <w:lsdException w:name="List Number 2" w:semiHidden="1" w:unhideWhenUsed="1"/>
+    <w:lsdException w:name="List Number 3" w:semiHidden="1" w:unhideWhenUsed="1"/>
+    <w:lsdException w:name="List Number 4" w:semiHidden="1" w:unhideWhenUsed="1"/>
+    <w:lsdException w:name="List Number 5" w:semiHidden="1" w:unhideWhenUsed="1"/>
+    <w:lsdException w:name="Title" w:uiPriority="10" w:qFormat="1"/>
+    <w:lsdException w:name="Closing" w:semiHidden="1" w:unhideWhenUsed="1"/>
+    <w:lsdException w:name="Signature" w:semiHidden="1" w:unhideWhenUsed="1"/>
+    <w:lsdException w:name="Default Paragraph Font" w:semiHidden="1" w:uiPriority="1" w:unhideWhenUsed="1"/>
+    <w:lsdException w:name="Body Text" w:semiHidden="1" w:unhideWhenUsed="1"/>
+    <w:lsdException w:name="Body Text Indent" w:semiHidden="1" w:unhideWhenUsed="1"/>
+    <w:lsdException w:name="List Continue" w:semiHidden="1" w:unhideWhenUsed="1"/>
+    <w:lsdException w:name="List Continue 2" w:semiHidden="1" w:unhideWhenUsed="1"/>
+    <w:lsdException w:name="List Continue 3" w:semiHidden="1" w:unhideWhenUsed="1"/>
+    <w:lsdException w:name="List Continue 4" w:semiHidden="1" w:unhideWhenUsed="1"/>
+    <w:lsdException w:name="List Continue 5" w:semiHidden="1" w:unhideWhenUsed="1"/>
+    <w:lsdException w:name="Message Header" w:semiHidden="1" w:unhideWhenUsed="1"/>
+    <w:lsdException w:name="Subtitle" w:uiPriority="11" w:qFormat="1"/>
+    <w:lsdException w:name="Salutation" w:semiHidden="1" w:unhideWhenUsed="1"/>
+    <w:lsdException w:name="Date" w:semiHidden="1" w:unhideWhenUsed="1"/>
+    <w:lsdException w:name="Body Text First Indent" w:semiHidden="1" w:unhideWhenUsed="1"/>
+    <w:lsdException w:name="Body Text First Indent 2" w:semiHidden="1" w:unhideWhenUsed="1"/>
+    <w:lsdException w:name="Note Heading" w:semiHidden="1" w:unhideWhenUsed="1"/>
+    <w:lsdException w:name="Body Text 2" w:semiHidden="1" w:unhideWhenUsed="1"/>
+    <w:lsdException w:name="Body Text 3" w:semiHidden="1" w:unhideWhenUsed="1"/>
+    <w:lsdException w:name="Body Text Indent 2" w:semiHidden="1" w:unhideWhenUsed="1"/>
+    <w:lsdException w:name="Body Text Indent 3" w:semiHidden="1" w:unhideWhenUsed="1"/>
+    <w:lsdException w:name="Block Text" w:semiHidden="1" w:unhideWhenUsed="1"/>
+    <w:lsdException w:name="Hyperlink" w:semiHidden="1" w:unhideWhenUsed="1"/>
+    <w:lsdException w:name="FollowedHyperlink" w:semiHidden="1" w:unhideWhenUsed="1"/>
+    <w:lsdException w:name="Strong" w:uiPriority="22" w:qFormat="1"/>
+    <w:lsdException w:name="Emphasis" w:uiPriority="20" w:qFormat="1"/>
+    <w:lsdException w:name="Document Map" w:semiHidden="1" w:unhideWhenUsed="1"/>
+    <w:lsdException w:name="Plain Text" w:semiHidden="1" w:unhideWhenUsed="1"/>
+    <w:lsdException w:name="E-mail Signature" w:semiHidden="1" w:unhideWhenUsed="1"/>
+    <w:lsdException w:name="HTML Top of Form" w:semiHidden="1" w:unhideWhenUsed="1"/>
+    <w:lsdException w:name="HTML Bottom of Form" w:semiHidden="1" w:unhideWhenUsed="1"/>
+    <w:lsdException w:name="Normal (Web)" w:semiHidden="1" w:unhideWhenUsed="1"/>
+    <w:lsdException w:name="HTML Acronym" w:semiHidden="1" w:unhideWhenUsed="1"/>
+    <w:lsdException w:name="HTML Address" w:semiHidden="1" w:unhideWhenUsed="1"/>
+    <w:lsdException w:name="HTML Cite" w:semiHidden="1" w:unhideWhenUsed="1"/>
+    <w:lsdException w:name="HTML Code" w:semiHidden="1" w:unhideWhenUsed="1"/>
+    <w:lsdException w:name="HTML Definition" w:semiHidden="1" w:unhideWhenUsed="1"/>
+    <w:lsdException w:name="HTML Keyboard" w:semiHidden="1" w:unhideWhenUsed="1"/>
+    <w:lsdException w:name="HTML Preformatted" w:semiHidden="1" w:unhideWhenUsed="1"/>
+    <w:lsdException w:name="HTML Sample" w:semiHidden="1" w:unhideWhenUsed="1"/>
+    <w:lsdException w:name="HTML Typewriter" w:semiHidden="1" w:unhideWhenUsed="1"/>
+    <w:lsdException w:name="HTML Variable" w:semiHidden="1" w:unhideWhenUsed="1"/>
+    <w:lsdException w:name="Normal Table" w:semiHidden="1" w:unhideWhenUsed="1"/>
+    <w:lsdException w:name="annotation subject" w:semiHidden="1" w:unhideWhenUsed="1"/>
+    <w:lsdException w:name="No List" w:semiHidden="1" w:unhideWhenUsed="1"/>
+    <w:lsdException w:name="Outline List 1" w:semiHidden="1" w:unhideWhenUsed="1"/>
+    <w:lsdException w:name="Outline List 2" w:semiHidden="1" w:unhideWhenUsed="1"/>
+    <w:lsdException w:name="Outline List 3" w:semiHidden="1" w:unhideWhenUsed="1"/>
+    <w:lsdException w:name="Table Simple 1" w:semiHidden="1" w:unhideWhenUsed="1"/>
+    <w:lsdException w:name="Table Simple 2" w:semiHidden="1" w:unhideWhenUsed="1"/>
+    <w:lsdException w:name="Table Simple 3" w:semiHidden="1" w:unhideWhenUsed="1"/>
+    <w:lsdException w:name="Table Classic 1" w:semiHidden="1" w:unhideWhenUsed="1"/>
+    <w:lsdException w:name="Table Classic 2" w:semiHidden="1" w:unhideWhenUsed="1"/>
+    <w:lsdException w:name="Table Classic 3" w:semiHidden="1" w:unhideWhenUsed="1"/>
+    <w:lsdException w:name="Table Classic 4" w:semiHidden="1" w:unhideWhenUsed="1"/>
+    <w:lsdException w:name="Table Colorful 1" w:semiHidden="1" w:unhideWhenUsed="1"/>
+    <w:lsdException w:name="Table Colorful 2" w:semiHidden="1" w:unhideWhenUsed="1"/>
+    <w:lsdException w:name="Table Colorful 3" w:semiHidden="1" w:unhideWhenUsed="1"/>
+    <w:lsdException w:name="Table Columns 1" w:semiHidden="1" w:unhideWhenUsed="1"/>
+    <w:lsdException w:name="Table Columns 2" w:semiHidden="1" w:unhideWhenUsed="1"/>
+    <w:lsdException w:name="Table Columns 3" w:semiHidden="1" w:unhideWhenUsed="1"/>
+    <w:lsdException w:name="Table Columns 4" w:semiHidden="1" w:unhideWhenUsed="1"/>
+    <w:lsdException w:name="Table Columns 5" w:semiHidden="1" w:unhideWhenUsed="1"/>
+    <w:lsdException w:name="Table Grid 1" w:semiHidden="1" w:unhideWhenUsed="1"/>
+    <w:lsdException w:name="Table Grid 2" w:semiHidden="1" w:unhideWhenUsed="1"/>
+    <w:lsdException w:name="Table Grid 3" w:semiHidden="1" w:unhideWhenUsed="1"/>
+    <w:lsdException w:name="Table Grid 4" w:semiHidden="1" w:unhideWhenUsed="1"/>
+    <w:lsdException w:name="Table Grid 5" w:semiHidden="1" w:unhideWhenUsed="1"/>
+    <w:lsdException w:name="Table Grid 6" w:semiHidden="1" w:unhideWhenUsed="1"/>
+    <w:lsdException w:name="Table Grid 7" w:semiHidden="1" w:unhideWhenUsed="1"/>
+    <w:lsdException w:name="Table Grid 8" w:semiHidden="1" w:unhideWhenUsed="1"/>
+    <w:lsdException w:name="Table List 1" w:semiHidden="1" w:unhideWhenUsed="1"/>
+    <w:lsdException w:name="Table List 2" w:semiHidden="1" w:unhideWhenUsed="1"/>
+    <w:lsdException w:name="Table List 3" w:semiHidden="1" w:unhideWhenUsed="1"/>
+    <w:lsdException w:name="Table List 4" w:semiHidden="1" w:unhideWhenUsed="1"/>
+    <w:lsdException w:name="Table List 5" w:semiHidden="1" w:unhideWhenUsed="1"/>
+    <w:lsdException w:name="Table List 6" w:semiHidden="1" w:unhideWhenUsed="1"/>
+    <w:lsdException w:name="Table List 7" w:semiHidden="1" w:unhideWhenUsed="1"/>
+    <w:lsdException w:name="Table List 8" w:semiHidden="1" w:unhideWhenUsed="1"/>
+    <w:lsdException w:name="Table 3D effects 1" w:semiHidden="1" w:unhideWhenUsed="1"/>
+    <w:lsdException w:name="Table 3D effects 2" w:semiHidden="1" w:unhideWhenUsed="1"/>
+    <w:lsdException w:name="Table 3D effects 3" w:semiHidden="1" w:unhideWhenUsed="1"/>
+    <w:lsdException w:name="Table Contemporary" w:semiHidden="1" w:unhideWhenUsed="1"/>
+    <w:lsdException w:name="Table Elegant" w:semiHidden="1" w:unhideWhenUsed="1"/>
+    <w:lsdException w:name="Table Professional" w:semiHidden="1" w:unhideWhenUsed="1"/>
+    <w:lsdException w:name="Table Subtle 1" w:semiHidden="1" w:unhideWhenUsed="1"/>
+    <w:lsdException w:name="Table Subtle 2" w:semiHidden="1" w:unhideWhenUsed="1"/>
+    <w:lsdException w:name="Table Web 1" w:semiHidden="1" w:unhideWhenUsed="1"/>
+    <w:lsdException w:name="Table Web 2" w:semiHidden="1" w:unhideWhenUsed="1"/>
+    <w:lsdException w:name="Table Web 3" w:semiHidden="1" w:unhideWhenUsed="1"/>
+    <w:lsdException w:name="Balloon Text" w:semiHidden="1" w:unhideWhenUsed="1"/>
+    <w:lsdException w:name="Table Grid" w:semiHidden="1" w:uiPriority="39" w:unhideWhenUsed="1"/>
+    <w:lsdException w:name="Table Theme" w:semiHidden="1" w:unhideWhenUsed="1"/>
+    <w:lsdException w:name="Placeholder Text" w:semiHidden="1"/>
+    <w:lsdException w:name="No Spacing" w:uiPriority="1" w:qFormat="1"/>
+    <w:lsdException w:name="Light Shading" w:uiPriority="60"/>
+    <w:lsdException w:name="Light List" w:uiPriority="61"/>
+    <w:lsdException w:name="Light Grid" w:uiPriority="62"/>
+    <w:lsdException w:name="Medium Shading 1" w:uiPriority="63"/>
+    <w:lsdException w:name="Medium Shading 2" w:uiPriority="64"/>
+    <w:lsdException w:name="Medium List 1" w:uiPriority="65"/>
+    <w:lsdException w:name="Medium List 2" w:uiPriority="66"/>
+    <w:lsdException w:name="Medium Grid 1" w:uiPriority="67"/>
+    <w:lsdException w:name="Medium Grid 2" w:uiPriority="68"/>
+    <w:lsdException w:name="Medium Grid 3" w:uiPriority="69"/>
+    <w:lsdException w:name="Dark List" w:uiPriority="70"/>
+    <w:lsdException w:name="Colorful Shading" w:uiPriority="71"/>
+    <w:lsdException w:name="Colorful List" w:uiPriority="72"/>
+    <w:lsdException w:name="Colorful Grid" w:uiPriority="73"/>
+    <w:lsdException w:name="Light Shading Accent 1" w:uiPriority="60"/>
+    <w:lsdException w:name="Light List Accent 1" w:uiPriority="61"/>
+    <w:lsdException w:name="Light Grid Accent 1" w:uiPriority="62"/>
+    <w:lsdException w:name="Medium Shading 1 Accent 1" w:uiPriority="63"/>
+    <w:lsdException w:name="Medium Shading 2 Accent 1" w:uiPriority="64"/>
+    <w:lsdException w:name="Medium List 1 Accent 1" w:uiPriority="65"/>
+    <w:lsdException w:name="Revision" w:semiHidden="1"/>
+    <w:lsdException w:name="List Paragraph" w:uiPriority="34" w:qFormat="1"/>
+    <w:lsdException w:name="Quote" w:uiPriority="29" w:qFormat="1"/>
+    <w:lsdException w:name="Intense Quote" w:uiPriority="30" w:qFormat="1"/>
+    <w:lsdException w:name="Medium List 2 Accent 1" w:uiPriority="66"/>
+    <w:lsdException w:name="Medium Grid 1 Accent 1" w:uiPriority="67"/>
+    <w:lsdException w:name="Medium Grid 2 Accent 1" w:uiPriority="68"/>
+    <w:lsdException w:name="Medium Grid 3 Accent 1" w:uiPriority="69"/>
+    <w:lsdException w:name="Dark List Accent 1" w:uiPriority="70"/>
+    <w:lsdException w:name="Colorful Shading Accent 1" w:uiPriority="71"/>
+    <w:lsdException w:name="Colorful List Accent 1" w:uiPriority="72"/>
+    <w:lsdException w:name="Colorful Grid Accent 1" w:uiPriority="73"/>
+    <w:lsdException w:name="Light Shading Accent 2" w:uiPriority="60"/>
+    <w:lsdException w:name="Light List Accent 2" w:uiPriority="61"/>
+    <w:lsdException w:name="Light Grid Accent 2" w:uiPriority="62"/>
+    <w:lsdException w:name="Medium Shading 1 Accent 2" w:uiPriority="63"/>
+    <w:lsdException w:name="Medium Shading 2 Accent 2" w:uiPriority="64"/>
+    <w:lsdException w:name="Medium List 1 Accent 2" w:uiPriority="65"/>
+    <w:lsdException w:name="Medium List 2 Accent 2" w:uiPriority="66"/>
+    <w:lsdException w:name="Medium Grid 1 Accent 2" w:uiPriority="67"/>
+    <w:lsdException w:name="Medium Grid 2 Accent 2" w:uiPriority="68"/>
+    <w:lsdException w:name="Medium Grid 3 Accent 2" w:uiPriority="69"/>
+    <w:lsdException w:name="Dark List Accent 2" w:uiPriority="70"/>
+    <w:lsdException w:name="Colorful Shading Accent 2" w:uiPriority="71"/>
+    <w:lsdException w:name="Colorful List Accent 2" w:uiPriority="72"/>
+    <w:lsdException w:name="Colorful Grid Accent 2" w:uiPriority="73"/>
+    <w:lsdException w:name="Light Shading Accent 3" w:uiPriority="60"/>
+    <w:lsdException w:name="Light List Accent 3" w:uiPriority="61"/>
+    <w:lsdException w:name="Light Grid Accent 3" w:uiPriority="62"/>
+    <w:lsdException w:name="Medium Shading 1 Accent 3" w:uiPriority="63"/>
+    <w:lsdException w:name="Medium Shading 2 Accent 3" w:uiPriority="64"/>
+    <w:lsdException w:name="Medium List 1 Accent 3" w:uiPriority="65"/>
+    <w:lsdException w:name="Medium List 2 Accent 3" w:uiPriority="66"/>
+    <w:lsdException w:name="Medium Grid 1 Accent 3" w:uiPriority="67"/>
+    <w:lsdException w:name="Medium Grid 2 Accent 3" w:uiPriority="68"/>
+    <w:lsdException w:name="Medium Grid 3 Accent 3" w:uiPriority="69"/>
+    <w:lsdException w:name="Dark List Accent 3" w:uiPriority="70"/>
+    <w:lsdException w:name="Colorful Shading Accent 3" w:uiPriority="71"/>
+    <w:lsdException w:name="Colorful List Accent 3" w:uiPriority="72"/>
+    <w:lsdException w:name="Colorful Grid Accent 3" w:uiPriority="73"/>
+    <w:lsdException w:name="Light Shading Accent 4" w:uiPriority="60"/>
+    <w:lsdException w:name="Light List Accent 4" w:uiPriority="61"/>
+    <w:lsdException w:name="Light Grid Accent 4" w:uiPriority="62"/>
+    <w:lsdException w:name="Medium Shading 1 Accent 4" w:uiPriority="63"/>
+    <w:lsdException w:name="Medium Shading 2 Accent 4" w:uiPriority="64"/>
+    <w:lsdException w:name="Medium List 1 Accent 4" w:uiPriority="65"/>
+    <w:lsdException w:name="Medium List 2 Accent 4" w:uiPriority="66"/>
+    <w:lsdException w:name="Medium Grid 1 Accent 4" w:uiPriority="67"/>
+    <w:lsdException w:name="Medium Grid 2 Accent 4" w:uiPriority="68"/>
+    <w:lsdException w:name="Medium Grid 3 Accent 4" w:uiPriority="69"/>
+    <w:lsdException w:name="Dark List Accent 4" w:uiPriority="70"/>
+    <w:lsdException w:name="Colorful Shading Accent 4" w:uiPriority="71"/>
+    <w:lsdException w:name="Colorful List Accent 4" w:uiPriority="72"/>
+    <w:lsdException w:name="Colorful Grid Accent 4" w:uiPriority="73"/>
+    <w:lsdException w:name="Light Shading Accent 5" w:uiPriority="60"/>
+    <w:lsdException w:name="Light List Accent 5" w:uiPriority="61"/>
+    <w:lsdException w:name="Light Grid Accent 5" w:uiPriority="62"/>
+    <w:lsdException w:name="Medium Shading 1 Accent 5" w:uiPriority="63"/>
+    <w:lsdException w:name="Medium Shading 2 Accent 5" w:uiPriority="64"/>
+    <w:lsdException w:name="Medium List 1 Accent 5" w:uiPriority="65"/>
+    <w:lsdException w:name="Medium List 2 Accent 5" w:uiPriority="66"/>
+    <w:lsdException w:name="Medium Grid 1 Accent 5" w:uiPriority="67"/>
+    <w:lsdException w:name="Medium Grid 2 Accent 5" w:uiPriority="68"/>
+    <w:lsdException w:name="Medium Grid 3 Accent 5" w:uiPriority="69"/>
+    <w:lsdException w:name="Dark List Accent 5" w:uiPriority="70"/>
+    <w:lsdException w:name="Colorful Shading Accent 5" w:uiPriority="71"/>
+    <w:lsdException w:name="Colorful List Accent 5" w:uiPriority="72"/>
+    <w:lsdException w:name="Colorful Grid Accent 5" w:uiPriority="73"/>
+    <w:lsdException w:name="Light Shading Accent 6" w:uiPriority="60"/>
+    <w:lsdException w:name="Light List Accent 6" w:uiPriority="61"/>
+    <w:lsdException w:name="Light Grid Accent 6" w:uiPriority="62"/>
+    <w:lsdException w:name="Medium Shading 1 Accent 6" w:uiPriority="63"/>
+    <w:lsdException w:name="Medium Shading 2 Accent 6" w:uiPriority="64"/>
+    <w:lsdException w:name="Medium List 1 Accent 6" w:uiPriority="65"/>
+    <w:lsdException w:name="Medium List 2 Accent 6" w:uiPriority="66"/>
+    <w:lsdException w:name="Medium Grid 1 Accent 6" w:uiPriority="67"/>
+    <w:lsdException w:name="Medium Grid 2 Accent 6" w:uiPriority="68"/>
+    <w:lsdException w:name="Medium Grid 3 Accent 6" w:uiPriority="69"/>
+    <w:lsdException w:name="Dark List Accent 6" w:uiPriority="70"/>
+    <w:lsdException w:name="Colorful Shading Accent 6" w:uiPriority="71"/>
+    <w:lsdException w:name="Colorful List Accent 6" w:uiPriority="72"/>
+    <w:lsdException w:name="Colorful Grid Accent 6" w:uiPriority="73"/>
+    <w:lsdException w:name="Subtle Emphasis" w:uiPriority="19" w:qFormat="1"/>
+    <w:lsdException w:name="Intense Emphasis" w:uiPriority="21" w:qFormat="1"/>
+    <w:lsdException w:name="Subtle Reference" w:uiPriority="31" w:qFormat="1"/>
+    <w:lsdException w:name="Intense Reference" w:uiPriority="32" w:qFormat="1"/>
+    <w:lsdException w:name="Book Title" w:uiPriority="33" w:qFormat="1"/>
+    <w:lsdException w:name="Bibliography" w:semiHidden="1" w:uiPriority="37" w:unhideWhenUsed="1"/>
+    <w:lsdException w:name="TOC Heading" w:semiHidden="1" w:uiPriority="39" w:unhideWhenUsed="1" w:qFormat="1"/>
+    <w:lsdException w:name="Plain Table 1" w:uiPriority="41"/>
+    <w:lsdException w:name="Plain Table 2" w:uiPriority="42"/>
+    <w:lsdException w:name="Plain Table 3" w:uiPriority="43"/>
+    <w:lsdException w:name="Plain Table 4" w:uiPriority="44"/>
+    <w:lsdException w:name="Plain Table 5" w:uiPriority="45"/>
+    <w:lsdException w:name="Grid Table Light" w:uiPriority="40"/>
+    <w:lsdException w:name="Grid Table 1 Light" w:uiPriority="46"/>
+    <w:lsdException w:name="Grid Table 2" w:uiPriority="47"/>
+    <w:lsdException w:name="Grid Table 3" w:uiPriority="48"/>
+    <w:lsdException w:name="Grid Table 4" w:uiPriority="49"/>
+    <w:lsdException w:name="Grid Table 5 Dark" w:uiPriority="50"/>
+    <w:lsdException w:name="Grid Table 6 Colorful" w:uiPriority="51"/>
+    <w:lsdException w:name="Grid Table 7 Colorful" w:uiPriority="52"/>
+    <w:lsdException w:name="Grid Table 1 Light Accent 1" w:uiPriority="46"/>
+    <w:lsdException w:name="Grid Table 2 Accent 1" w:uiPriority="47"/>
+    <w:lsdException w:name="Grid Table 3 Accent 1" w:uiPriority="48"/>
+    <w:lsdException w:name="Grid Table 4 Accent 1" w:uiPriority="49"/>
+    <w:lsdException w:name="Grid Table 5 Dark Accent 1" w:uiPriority="50"/>
+    <w:lsdException w:name="Grid Table 6 Colorful Accent 1" w:uiPriority="51"/>
+    <w:lsdException w:name="Grid Table 7 Colorful Accent 1" w:uiPriority="52"/>
+    <w:lsdException w:name="Grid Table 1 Light Accent 2" w:uiPriority="46"/>
+    <w:lsdException w:name="Grid Table 2 Accent 2" w:uiPriority="47"/>
+    <w:lsdException w:name="Grid Table 3 Accent 2" w:uiPriority="48"/>
+    <w:lsdException w:name="Grid Table 4 Accent 2" w:uiPriority="49"/>
+    <w:lsdException w:name="Grid Table 5 Dark Accent 2" w:uiPriority="50"/>
+    <w:lsdException w:name="Grid Table 6 Colorful Accent 2" w:uiPriority="51"/>
+    <w:lsdException w:name="Grid Table 7 Colorful Accent 2" w:uiPriority="52"/>
+    <w:lsdException w:name="Grid Table 1 Light Accent 3" w:uiPriority="46"/>
+    <w:lsdException w:name="Grid Table 2 Accent 3" w:uiPriority="47"/>
+    <w:lsdException w:name="Grid Table 3 Accent 3" w:uiPriority="48"/>
+    <w:lsdException w:name="Grid Table 4 Accent 3" w:uiPriority="49"/>
+    <w:lsdException w:name="Grid Table 5 Dark Accent 3" w:uiPriority="50"/>
+    <w:lsdException w:name="Grid Table 6 Colorful Accent 3" w:uiPriority="51"/>
+    <w:lsdException w:name="Grid Table 7 Colorful Accent 3" w:uiPriority="52"/>
+    <w:lsdException w:name="Grid Table 1 Light Accent 4" w:uiPriority="46"/>
+    <w:lsdException w:name="Grid Table 2 Accent 4" w:uiPriority="47"/>
+    <w:lsdException w:name="Grid Table 3 Accent 4" w:uiPriority="48"/>
+    <w:lsdException w:name="Grid Table 4 Accent 4" w:uiPriority="49"/>
+    <w:lsdException w:name="Grid Table 5 Dark Accent 4" w:uiPriority="50"/>
+    <w:lsdException w:name="Grid Table 6 Colorful Accent 4" w:uiPriority="51"/>
+    <w:lsdException w:name="Grid Table 7 Colorful Accent 4" w:uiPriority="52"/>
+    <w:lsdException w:name="Grid Table 1 Light Accent 5" w:uiPriority="46"/>
+    <w:lsdException w:name="Grid Table 2 Accent 5" w:uiPriority="47"/>
+    <w:lsdException w:name="Grid Table 3 Accent 5" w:uiPriority="48"/>
+    <w:lsdException w:name="Grid Table 4 Accent 5" w:uiPriority="49"/>
+    <w:lsdException w:name="Grid Table 5 Dark Accent 5" w:uiPriority="50"/>
+    <w:lsdException w:name="Grid Table 6 Colorful Accent 5" w:uiPriority="51"/>
+    <w:lsdException w:name="Grid Table 7 Colorful Accent 5" w:uiPriority="52"/>
+    <w:lsdException w:name="Grid Table 1 Light Accent 6" w:uiPriority="46"/>
+    <w:lsdException w:name="Grid Table 2 Accent 6" w:uiPriority="47"/>
+    <w:lsdException w:name="Grid Table 3 Accent 6" w:uiPriority="48"/>
+    <w:lsdException w:name="Grid Table 4 Accent 6" w:uiPriority="49"/>
+    <w:lsdException w:name="Grid Table 5 Dark Accent 6" w:uiPriority="50"/>
+    <w:lsdException w:name="Grid Table 6 Colorful Accent 6" w:uiPriority="51"/>
+    <w:lsdException w:name="Grid Table 7 Colorful Accent 6" w:uiPriority="52"/>
+    <w:lsdException w:name="List Table 1 Light" w:uiPriority="46"/>
+    <w:lsdException w:name="List Table 2" w:uiPriority="47"/>
+    <w:lsdException w:name="List Table 3" w:uiPriority="48"/>
+    <w:lsdException w:name="List Table 4" w:uiPriority="49"/>
+    <w:lsdException w:name="List Table 5 Dark" w:uiPriority="50"/>
+    <w:lsdException w:name="List Table 6 Colorful" w:uiPriority="51"/>
+    <w:lsdException w:name="List Table 7 Colorful" w:uiPriority="52"/>
+    <w:lsdException w:name="List Table 1 Light Accent 1" w:uiPriority="46"/>
+    <w:lsdException w:name="List Table 2 Accent 1" w:uiPriority="47"/>
+    <w:lsdException w:name="List Table 3 Accent 1" w:uiPriority="48"/>
+    <w:lsdException w:name="List Table 4 Accent 1" w:uiPriority="49"/>
+    <w:lsdException w:name="List Table 5 Dark Accent 1" w:uiPriority="50"/>
+    <w:lsdException w:name="List Table 6 Colorful Accent 1" w:uiPriority="51"/>
+    <w:lsdException w:name="List Table 7 Colorful Accent 1" w:uiPriority="52"/>
+    <w:lsdException w:name="List Table 1 Light Accent 2" w:uiPriority="46"/>
+    <w:lsdException w:name="List Table 2 Accent 2" w:uiPriority="47"/>
+    <w:lsdException w:name="List Table 3 Accent 2" w:uiPriority="48"/>
+    <w:lsdException w:name="List Table 4 Accent 2" w:uiPriority="49"/>
+    <w:lsdException w:name="List Table 5 Dark Accent 2" w:uiPriority="50"/>
+    <w:lsdException w:name="List Table 6 Colorful Accent 2" w:uiPriority="51"/>
+    <w:lsdException w:name="List Table 7 Colorful Accent 2" w:uiPriority="52"/>
+    <w:lsdException w:name="List Table 1 Light Accent 3" w:uiPriority="46"/>
+    <w:lsdException w:name="List Table 2 Accent 3" w:uiPriority="47"/>
+    <w:lsdException w:name="List Table 3 Accent 3" w:uiPriority="48"/>
+    <w:lsdException w:name="List Table 4 Accent 3" w:uiPriority="49"/>
+    <w:lsdException w:name="List Table 5 Dark Accent 3" w:uiPriority="50"/>
+    <w:lsdException w:name="List Table 6 Colorful Accent 3" w:uiPriority="51"/>
+    <w:lsdException w:name="List Table 7 Colorful Accent 3" w:uiPriority="52"/>
+    <w:lsdException w:name="List Table 1 Light Accent 4" w:uiPriority="46"/>
+    <w:lsdException w:name="List Table 2 Accent 4" w:uiPriority="47"/>
+    <w:lsdException w:name="List Table 3 Accent 4" w:uiPriority="48"/>
+    <w:lsdException w:name="List Table 4 Accent 4" w:uiPriority="49"/>
+    <w:lsdException w:name="List Table 5 Dark Accent 4" w:uiPriority="50"/>
+    <w:lsdException w:name="List Table 6 Colorful Accent 4" w:uiPriority="51"/>
+    <w:lsdException w:name="List Table 7 Colorful Accent 4" w:uiPriority="52"/>
+    <w:lsdException w:name="List Table 1 Light Accent 5" w:uiPriority="46"/>
+    <w:lsdException w:name="List Table 2 Accent 5" w:uiPriority="47"/>
+    <w:lsdException w:name="List Table 3 Accent 5" w:uiPriority="48"/>
+    <w:lsdException w:name="List Table 4 Accent 5" w:uiPriority="49"/>
+    <w:lsdException w:name="List Table 5 Dark Accent 5" w:uiPriority="50"/>
+    <w:lsdException w:name="List Table 6 Colorful Accent 5" w:uiPriority="51"/>
+    <w:lsdException w:name="List Table 7 Colorful Accent 5" w:uiPriority="52"/>
+    <w:lsdException w:name="List Table 1 Light Accent 6" w:uiPriority="46"/>
+    <w:lsdException w:name="List Table 2 Accent 6" w:uiPriority="47"/>
+    <w:lsdException w:name="List Table 3 Accent 6" w:uiPriority="48"/>
+    <w:lsdException w:name="List Table 4 Accent 6" w:uiPriority="49"/>
+    <w:lsdException w:name="List Table 5 Dark Accent 6" w:uiPriority="50"/>
+    <w:lsdException w:name="List Table 6 Colorful Accent 6" w:uiPriority="51"/>
+    <w:lsdException w:name="List Table 7 Colorful Accent 6" w:uiPriority="52"/>
+    <w:lsdException w:name="Mention" w:semiHidden="1" w:unhideWhenUsed="1"/>
+    <w:lsdException w:name="Smart Hyperlink" w:semiHidden="1" w:unhideWhenUsed="1"/>
+    <w:lsdException w:name="Hashtag" w:semiHidden="1" w:unhideWhenUsed="1"/>
+    <w:lsdException w:name="Unresolved Mention" w:semiHidden="1" w:unhideWhenUsed="1"/>
+    <w:lsdException w:name="Smart Link" w:semiHidden="1" w:unhideWhenUsed="1"/>
   </w:latentStyles>
   <w:style w:type="paragraph" w:default="1" w:styleId="Normal">
     <w:name w:val="Normal"/>
@@ -3973,7 +3453,7 @@
   <a:extraClrSchemeLst/>
   <a:extLst>
     <a:ext uri="{05A4C25C-085E-4340-85A3-A5531E510DB2}">
-      <thm15:themeFamily xmlns:thm15="http://schemas.microsoft.com/office/thememl/2012/main" xmlns="" name="Office Theme" id="{62F939B6-93AF-4DB8-9C6B-D6C7DFDC589F}" vid="{4A3C46E8-61CC-4603-A589-7422A47A8E4A}"/>
+      <thm15:themeFamily xmlns:thm15="http://schemas.microsoft.com/office/thememl/2012/main" name="Office Theme" id="{62F939B6-93AF-4DB8-9C6B-D6C7DFDC589F}" vid="{4A3C46E8-61CC-4603-A589-7422A47A8E4A}"/>
     </a:ext>
   </a:extLst>
 </a:theme>

</xml_diff>